<commit_message>
Methodology, time line and data sources
</commit_message>
<xml_diff>
--- a/2026784 Late Payment Prediction CA1.docx
+++ b/2026784 Late Payment Prediction CA1.docx
@@ -1109,7 +1109,6 @@
     <w:p/>
     <w:p/>
     <w:p/>
-    <w:p/>
     <w:p>
       <w:pPr>
         <w:sectPr>
@@ -1120,81 +1119,6 @@
         </w:sectPr>
       </w:pPr>
     </w:p>
-    <w:p>
-      <w:pPr>
-        <w:rPr>
-          <w:color w:val="3A3A3A"/>
-          <w:sz w:val="40"/>
-          <w:szCs w:val="40"/>
-        </w:rPr>
-      </w:pPr>
-      <w:r>
-        <w:rPr>
-          <w:color w:val="3A3A3A"/>
-          <w:sz w:val="40"/>
-          <w:szCs w:val="40"/>
-        </w:rPr>
-        <w:lastRenderedPageBreak/>
-        <w:t>Abstract</w:t>
-      </w:r>
-    </w:p>
-    <w:p/>
-    <w:p>
-      <w:pPr>
-        <w:rPr>
-          <w:color w:val="FF0000"/>
-        </w:rPr>
-      </w:pPr>
-      <w:r>
-        <w:rPr>
-          <w:color w:val="FF0000"/>
-        </w:rPr>
-        <w:t xml:space="preserve">[NOTE: This section is designated for the abstract. Abstracts are not assigned page numbers and should precede the table of contents. If an abstract is unnecessary for your work, please delete this page.] </w:t>
-      </w:r>
-    </w:p>
-    <w:p>
-      <w:pPr>
-        <w:rPr>
-          <w:color w:val="FF0000"/>
-        </w:rPr>
-      </w:pPr>
-    </w:p>
-    <w:p>
-      <w:pPr>
-        <w:rPr>
-          <w:color w:val="FF0000"/>
-        </w:rPr>
-      </w:pPr>
-    </w:p>
-    <w:p>
-      <w:pPr>
-        <w:rPr>
-          <w:color w:val="FF0000"/>
-        </w:rPr>
-      </w:pPr>
-    </w:p>
-    <w:p/>
-    <w:p/>
-    <w:p/>
-    <w:p/>
-    <w:p/>
-    <w:p/>
-    <w:p/>
-    <w:p/>
-    <w:p/>
-    <w:p/>
-    <w:p/>
-    <w:p/>
-    <w:p/>
-    <w:p/>
-    <w:p/>
-    <w:p/>
-    <w:p/>
-    <w:p/>
-    <w:p/>
-    <w:p/>
-    <w:p/>
-    <w:p/>
     <w:p>
       <w:pPr>
         <w:keepNext/>
@@ -1236,22 +1160,18 @@
       <w:sdtContent>
         <w:p>
           <w:pPr>
-            <w:pBdr>
-              <w:top w:val="nil"/>
-              <w:left w:val="nil"/>
-              <w:bottom w:val="nil"/>
-              <w:right w:val="nil"/>
-              <w:between w:val="nil"/>
-            </w:pBdr>
+            <w:pStyle w:val="TOC1"/>
             <w:tabs>
               <w:tab w:val="right" w:leader="dot" w:pos="9016"/>
             </w:tabs>
-            <w:spacing w:after="100"/>
             <w:rPr>
-              <w:rFonts w:ascii="Aptos" w:eastAsia="Aptos" w:hAnsi="Aptos" w:cs="Aptos"/>
-              <w:color w:val="000000"/>
+              <w:rFonts w:asciiTheme="minorHAnsi" w:eastAsiaTheme="minorEastAsia" w:hAnsiTheme="minorHAnsi" w:cstheme="minorBidi"/>
+              <w:noProof/>
+              <w:kern w:val="2"/>
               <w:sz w:val="24"/>
               <w:szCs w:val="24"/>
+              <w:lang w:val="en-US" w:eastAsia="en-US"/>
+              <w14:ligatures w14:val="standardContextual"/>
             </w:rPr>
           </w:pPr>
           <w:r>
@@ -1263,165 +1183,875 @@
           <w:r>
             <w:fldChar w:fldCharType="separate"/>
           </w:r>
-          <w:hyperlink w:anchor="_heading=h.gjdgxs">
-            <w:r>
-              <w:rPr>
-                <w:color w:val="000000"/>
+          <w:hyperlink w:anchor="_Toc243411867" w:history="1">
+            <w:r>
+              <w:rPr>
+                <w:rStyle w:val="Hyperlink"/>
+                <w:noProof/>
               </w:rPr>
               <w:t>Introduction</w:t>
             </w:r>
             <w:r>
               <w:rPr>
-                <w:color w:val="000000"/>
+                <w:noProof/>
+                <w:webHidden/>
               </w:rPr>
               <w:tab/>
+            </w:r>
+            <w:r>
+              <w:rPr>
+                <w:noProof/>
+                <w:webHidden/>
+              </w:rPr>
+              <w:fldChar w:fldCharType="begin"/>
+            </w:r>
+            <w:r>
+              <w:rPr>
+                <w:noProof/>
+                <w:webHidden/>
+              </w:rPr>
+              <w:instrText xml:space="preserve"> PAGEREF _Toc243411867 \h </w:instrText>
+            </w:r>
+            <w:r>
+              <w:rPr>
+                <w:noProof/>
+                <w:webHidden/>
+              </w:rPr>
+            </w:r>
+            <w:r>
+              <w:rPr>
+                <w:noProof/>
+                <w:webHidden/>
+              </w:rPr>
+              <w:fldChar w:fldCharType="separate"/>
+            </w:r>
+            <w:r>
+              <w:rPr>
+                <w:noProof/>
+                <w:webHidden/>
+              </w:rPr>
               <w:t>1</w:t>
+            </w:r>
+            <w:r>
+              <w:rPr>
+                <w:noProof/>
+                <w:webHidden/>
+              </w:rPr>
+              <w:fldChar w:fldCharType="end"/>
             </w:r>
           </w:hyperlink>
         </w:p>
         <w:p>
           <w:pPr>
-            <w:pBdr>
-              <w:top w:val="nil"/>
-              <w:left w:val="nil"/>
-              <w:bottom w:val="nil"/>
-              <w:right w:val="nil"/>
-              <w:between w:val="nil"/>
-            </w:pBdr>
+            <w:pStyle w:val="TOC1"/>
             <w:tabs>
               <w:tab w:val="right" w:leader="dot" w:pos="9016"/>
             </w:tabs>
-            <w:spacing w:after="100"/>
             <w:rPr>
-              <w:rFonts w:ascii="Aptos" w:eastAsia="Aptos" w:hAnsi="Aptos" w:cs="Aptos"/>
-              <w:color w:val="000000"/>
+              <w:rFonts w:asciiTheme="minorHAnsi" w:eastAsiaTheme="minorEastAsia" w:hAnsiTheme="minorHAnsi" w:cstheme="minorBidi"/>
+              <w:noProof/>
+              <w:kern w:val="2"/>
               <w:sz w:val="24"/>
               <w:szCs w:val="24"/>
+              <w:lang w:val="en-US" w:eastAsia="en-US"/>
+              <w14:ligatures w14:val="standardContextual"/>
             </w:rPr>
           </w:pPr>
-          <w:hyperlink w:anchor="_heading=h.30j0zll">
-            <w:r>
-              <w:rPr>
-                <w:color w:val="000000"/>
-              </w:rPr>
-              <w:t>Chapter 1</w:t>
-            </w:r>
-            <w:r>
-              <w:rPr>
-                <w:color w:val="000000"/>
+          <w:hyperlink w:anchor="_Toc243411868" w:history="1">
+            <w:r>
+              <w:rPr>
+                <w:rStyle w:val="Hyperlink"/>
+                <w:noProof/>
+              </w:rPr>
+              <w:t>Problem Definition</w:t>
+            </w:r>
+            <w:r>
+              <w:rPr>
+                <w:noProof/>
+                <w:webHidden/>
               </w:rPr>
               <w:tab/>
-              <w:t>1</w:t>
+            </w:r>
+            <w:r>
+              <w:rPr>
+                <w:noProof/>
+                <w:webHidden/>
+              </w:rPr>
+              <w:fldChar w:fldCharType="begin"/>
+            </w:r>
+            <w:r>
+              <w:rPr>
+                <w:noProof/>
+                <w:webHidden/>
+              </w:rPr>
+              <w:instrText xml:space="preserve"> PAGEREF _Toc243411868 \h </w:instrText>
+            </w:r>
+            <w:r>
+              <w:rPr>
+                <w:noProof/>
+                <w:webHidden/>
+              </w:rPr>
+            </w:r>
+            <w:r>
+              <w:rPr>
+                <w:noProof/>
+                <w:webHidden/>
+              </w:rPr>
+              <w:fldChar w:fldCharType="separate"/>
+            </w:r>
+            <w:r>
+              <w:rPr>
+                <w:noProof/>
+                <w:webHidden/>
+              </w:rPr>
+              <w:t>2</w:t>
+            </w:r>
+            <w:r>
+              <w:rPr>
+                <w:noProof/>
+                <w:webHidden/>
+              </w:rPr>
+              <w:fldChar w:fldCharType="end"/>
             </w:r>
           </w:hyperlink>
         </w:p>
         <w:p>
           <w:pPr>
-            <w:pBdr>
-              <w:top w:val="nil"/>
-              <w:left w:val="nil"/>
-              <w:bottom w:val="nil"/>
-              <w:right w:val="nil"/>
-              <w:between w:val="nil"/>
-            </w:pBdr>
+            <w:pStyle w:val="TOC1"/>
             <w:tabs>
               <w:tab w:val="right" w:leader="dot" w:pos="9016"/>
             </w:tabs>
-            <w:spacing w:after="100"/>
-            <w:ind w:left="220"/>
             <w:rPr>
-              <w:rFonts w:ascii="Aptos" w:eastAsia="Aptos" w:hAnsi="Aptos" w:cs="Aptos"/>
-              <w:color w:val="000000"/>
+              <w:rFonts w:asciiTheme="minorHAnsi" w:eastAsiaTheme="minorEastAsia" w:hAnsiTheme="minorHAnsi" w:cstheme="minorBidi"/>
+              <w:noProof/>
+              <w:kern w:val="2"/>
               <w:sz w:val="24"/>
               <w:szCs w:val="24"/>
+              <w:lang w:val="en-US" w:eastAsia="en-US"/>
+              <w14:ligatures w14:val="standardContextual"/>
             </w:rPr>
           </w:pPr>
-          <w:hyperlink w:anchor="_heading=h.1fob9te">
-            <w:r>
-              <w:rPr>
-                <w:color w:val="000000"/>
-              </w:rPr>
-              <w:t>Chapter 1.1</w:t>
-            </w:r>
-            <w:r>
-              <w:rPr>
-                <w:color w:val="000000"/>
+          <w:hyperlink w:anchor="_Toc243411869" w:history="1">
+            <w:r>
+              <w:rPr>
+                <w:rStyle w:val="Hyperlink"/>
+                <w:noProof/>
+              </w:rPr>
+              <w:t>Aim and objectives</w:t>
+            </w:r>
+            <w:r>
+              <w:rPr>
+                <w:noProof/>
+                <w:webHidden/>
               </w:rPr>
               <w:tab/>
-              <w:t>1</w:t>
+            </w:r>
+            <w:r>
+              <w:rPr>
+                <w:noProof/>
+                <w:webHidden/>
+              </w:rPr>
+              <w:fldChar w:fldCharType="begin"/>
+            </w:r>
+            <w:r>
+              <w:rPr>
+                <w:noProof/>
+                <w:webHidden/>
+              </w:rPr>
+              <w:instrText xml:space="preserve"> PAGEREF _Toc243411869 \h </w:instrText>
+            </w:r>
+            <w:r>
+              <w:rPr>
+                <w:noProof/>
+                <w:webHidden/>
+              </w:rPr>
+            </w:r>
+            <w:r>
+              <w:rPr>
+                <w:noProof/>
+                <w:webHidden/>
+              </w:rPr>
+              <w:fldChar w:fldCharType="separate"/>
+            </w:r>
+            <w:r>
+              <w:rPr>
+                <w:noProof/>
+                <w:webHidden/>
+              </w:rPr>
+              <w:t>3</w:t>
+            </w:r>
+            <w:r>
+              <w:rPr>
+                <w:noProof/>
+                <w:webHidden/>
+              </w:rPr>
+              <w:fldChar w:fldCharType="end"/>
             </w:r>
           </w:hyperlink>
         </w:p>
         <w:p>
           <w:pPr>
-            <w:pBdr>
-              <w:top w:val="nil"/>
-              <w:left w:val="nil"/>
-              <w:bottom w:val="nil"/>
-              <w:right w:val="nil"/>
-              <w:between w:val="nil"/>
-            </w:pBdr>
+            <w:pStyle w:val="TOC2"/>
             <w:tabs>
               <w:tab w:val="right" w:leader="dot" w:pos="9016"/>
             </w:tabs>
-            <w:spacing w:after="100"/>
-            <w:ind w:left="440"/>
             <w:rPr>
-              <w:rFonts w:ascii="Aptos" w:eastAsia="Aptos" w:hAnsi="Aptos" w:cs="Aptos"/>
-              <w:color w:val="000000"/>
+              <w:rFonts w:asciiTheme="minorHAnsi" w:eastAsiaTheme="minorEastAsia" w:hAnsiTheme="minorHAnsi" w:cstheme="minorBidi"/>
+              <w:noProof/>
+              <w:kern w:val="2"/>
               <w:sz w:val="24"/>
               <w:szCs w:val="24"/>
+              <w:lang w:val="en-US" w:eastAsia="en-US"/>
+              <w14:ligatures w14:val="standardContextual"/>
             </w:rPr>
           </w:pPr>
-          <w:hyperlink w:anchor="_heading=h.3znysh7">
-            <w:r>
-              <w:rPr>
-                <w:color w:val="000000"/>
-              </w:rPr>
-              <w:t>Chapter 1.1.1.</w:t>
-            </w:r>
-            <w:r>
-              <w:rPr>
-                <w:color w:val="000000"/>
+          <w:hyperlink w:anchor="_Toc243411870" w:history="1">
+            <w:r>
+              <w:rPr>
+                <w:rStyle w:val="Hyperlink"/>
+                <w:noProof/>
+              </w:rPr>
+              <w:t>Aim</w:t>
+            </w:r>
+            <w:r>
+              <w:rPr>
+                <w:noProof/>
+                <w:webHidden/>
               </w:rPr>
               <w:tab/>
-              <w:t>1</w:t>
+            </w:r>
+            <w:r>
+              <w:rPr>
+                <w:noProof/>
+                <w:webHidden/>
+              </w:rPr>
+              <w:fldChar w:fldCharType="begin"/>
+            </w:r>
+            <w:r>
+              <w:rPr>
+                <w:noProof/>
+                <w:webHidden/>
+              </w:rPr>
+              <w:instrText xml:space="preserve"> PAGEREF _Toc243411870 \h </w:instrText>
+            </w:r>
+            <w:r>
+              <w:rPr>
+                <w:noProof/>
+                <w:webHidden/>
+              </w:rPr>
+            </w:r>
+            <w:r>
+              <w:rPr>
+                <w:noProof/>
+                <w:webHidden/>
+              </w:rPr>
+              <w:fldChar w:fldCharType="separate"/>
+            </w:r>
+            <w:r>
+              <w:rPr>
+                <w:noProof/>
+                <w:webHidden/>
+              </w:rPr>
+              <w:t>3</w:t>
+            </w:r>
+            <w:r>
+              <w:rPr>
+                <w:noProof/>
+                <w:webHidden/>
+              </w:rPr>
+              <w:fldChar w:fldCharType="end"/>
             </w:r>
           </w:hyperlink>
         </w:p>
         <w:p>
           <w:pPr>
-            <w:pBdr>
-              <w:top w:val="nil"/>
-              <w:left w:val="nil"/>
-              <w:bottom w:val="nil"/>
-              <w:right w:val="nil"/>
-              <w:between w:val="nil"/>
-            </w:pBdr>
+            <w:pStyle w:val="TOC2"/>
             <w:tabs>
               <w:tab w:val="right" w:leader="dot" w:pos="9016"/>
             </w:tabs>
-            <w:spacing w:after="100"/>
             <w:rPr>
-              <w:rFonts w:ascii="Aptos" w:eastAsia="Aptos" w:hAnsi="Aptos" w:cs="Aptos"/>
-              <w:color w:val="000000"/>
+              <w:rFonts w:asciiTheme="minorHAnsi" w:eastAsiaTheme="minorEastAsia" w:hAnsiTheme="minorHAnsi" w:cstheme="minorBidi"/>
+              <w:noProof/>
+              <w:kern w:val="2"/>
               <w:sz w:val="24"/>
               <w:szCs w:val="24"/>
+              <w:lang w:val="en-US" w:eastAsia="en-US"/>
+              <w14:ligatures w14:val="standardContextual"/>
             </w:rPr>
           </w:pPr>
-          <w:hyperlink w:anchor="_heading=h.2et92p0">
-            <w:r>
-              <w:rPr>
-                <w:color w:val="000000"/>
+          <w:hyperlink w:anchor="_Toc243411871" w:history="1">
+            <w:r>
+              <w:rPr>
+                <w:rStyle w:val="Hyperlink"/>
+                <w:noProof/>
+              </w:rPr>
+              <w:t>Objectives</w:t>
+            </w:r>
+            <w:r>
+              <w:rPr>
+                <w:noProof/>
+                <w:webHidden/>
+              </w:rPr>
+              <w:tab/>
+            </w:r>
+            <w:r>
+              <w:rPr>
+                <w:noProof/>
+                <w:webHidden/>
+              </w:rPr>
+              <w:fldChar w:fldCharType="begin"/>
+            </w:r>
+            <w:r>
+              <w:rPr>
+                <w:noProof/>
+                <w:webHidden/>
+              </w:rPr>
+              <w:instrText xml:space="preserve"> PAGEREF _Toc243411871 \h </w:instrText>
+            </w:r>
+            <w:r>
+              <w:rPr>
+                <w:noProof/>
+                <w:webHidden/>
+              </w:rPr>
+            </w:r>
+            <w:r>
+              <w:rPr>
+                <w:noProof/>
+                <w:webHidden/>
+              </w:rPr>
+              <w:fldChar w:fldCharType="separate"/>
+            </w:r>
+            <w:r>
+              <w:rPr>
+                <w:noProof/>
+                <w:webHidden/>
+              </w:rPr>
+              <w:t>3</w:t>
+            </w:r>
+            <w:r>
+              <w:rPr>
+                <w:noProof/>
+                <w:webHidden/>
+              </w:rPr>
+              <w:fldChar w:fldCharType="end"/>
+            </w:r>
+          </w:hyperlink>
+        </w:p>
+        <w:p>
+          <w:pPr>
+            <w:pStyle w:val="TOC1"/>
+            <w:tabs>
+              <w:tab w:val="right" w:leader="dot" w:pos="9016"/>
+            </w:tabs>
+            <w:rPr>
+              <w:rFonts w:asciiTheme="minorHAnsi" w:eastAsiaTheme="minorEastAsia" w:hAnsiTheme="minorHAnsi" w:cstheme="minorBidi"/>
+              <w:noProof/>
+              <w:kern w:val="2"/>
+              <w:sz w:val="24"/>
+              <w:szCs w:val="24"/>
+              <w:lang w:val="en-US" w:eastAsia="en-US"/>
+              <w14:ligatures w14:val="standardContextual"/>
+            </w:rPr>
+          </w:pPr>
+          <w:hyperlink w:anchor="_Toc243411872" w:history="1">
+            <w:r>
+              <w:rPr>
+                <w:rStyle w:val="Hyperlink"/>
+                <w:noProof/>
+              </w:rPr>
+              <w:t>Scope</w:t>
+            </w:r>
+            <w:r>
+              <w:rPr>
+                <w:noProof/>
+                <w:webHidden/>
+              </w:rPr>
+              <w:tab/>
+            </w:r>
+            <w:r>
+              <w:rPr>
+                <w:noProof/>
+                <w:webHidden/>
+              </w:rPr>
+              <w:fldChar w:fldCharType="begin"/>
+            </w:r>
+            <w:r>
+              <w:rPr>
+                <w:noProof/>
+                <w:webHidden/>
+              </w:rPr>
+              <w:instrText xml:space="preserve"> PAGEREF _Toc243411872 \h </w:instrText>
+            </w:r>
+            <w:r>
+              <w:rPr>
+                <w:noProof/>
+                <w:webHidden/>
+              </w:rPr>
+            </w:r>
+            <w:r>
+              <w:rPr>
+                <w:noProof/>
+                <w:webHidden/>
+              </w:rPr>
+              <w:fldChar w:fldCharType="separate"/>
+            </w:r>
+            <w:r>
+              <w:rPr>
+                <w:noProof/>
+                <w:webHidden/>
+              </w:rPr>
+              <w:t>4</w:t>
+            </w:r>
+            <w:r>
+              <w:rPr>
+                <w:noProof/>
+                <w:webHidden/>
+              </w:rPr>
+              <w:fldChar w:fldCharType="end"/>
+            </w:r>
+          </w:hyperlink>
+        </w:p>
+        <w:p>
+          <w:pPr>
+            <w:pStyle w:val="TOC1"/>
+            <w:tabs>
+              <w:tab w:val="right" w:leader="dot" w:pos="9016"/>
+            </w:tabs>
+            <w:rPr>
+              <w:rFonts w:asciiTheme="minorHAnsi" w:eastAsiaTheme="minorEastAsia" w:hAnsiTheme="minorHAnsi" w:cstheme="minorBidi"/>
+              <w:noProof/>
+              <w:kern w:val="2"/>
+              <w:sz w:val="24"/>
+              <w:szCs w:val="24"/>
+              <w:lang w:val="en-US" w:eastAsia="en-US"/>
+              <w14:ligatures w14:val="standardContextual"/>
+            </w:rPr>
+          </w:pPr>
+          <w:hyperlink w:anchor="_Toc243411873" w:history="1">
+            <w:r>
+              <w:rPr>
+                <w:rStyle w:val="Hyperlink"/>
+                <w:noProof/>
+              </w:rPr>
+              <w:t>Methodology</w:t>
+            </w:r>
+            <w:r>
+              <w:rPr>
+                <w:noProof/>
+                <w:webHidden/>
+              </w:rPr>
+              <w:tab/>
+            </w:r>
+            <w:r>
+              <w:rPr>
+                <w:noProof/>
+                <w:webHidden/>
+              </w:rPr>
+              <w:fldChar w:fldCharType="begin"/>
+            </w:r>
+            <w:r>
+              <w:rPr>
+                <w:noProof/>
+                <w:webHidden/>
+              </w:rPr>
+              <w:instrText xml:space="preserve"> PAGEREF _Toc243411873 \h </w:instrText>
+            </w:r>
+            <w:r>
+              <w:rPr>
+                <w:noProof/>
+                <w:webHidden/>
+              </w:rPr>
+            </w:r>
+            <w:r>
+              <w:rPr>
+                <w:noProof/>
+                <w:webHidden/>
+              </w:rPr>
+              <w:fldChar w:fldCharType="separate"/>
+            </w:r>
+            <w:r>
+              <w:rPr>
+                <w:noProof/>
+                <w:webHidden/>
+              </w:rPr>
+              <w:t>5</w:t>
+            </w:r>
+            <w:r>
+              <w:rPr>
+                <w:noProof/>
+                <w:webHidden/>
+              </w:rPr>
+              <w:fldChar w:fldCharType="end"/>
+            </w:r>
+          </w:hyperlink>
+        </w:p>
+        <w:p>
+          <w:pPr>
+            <w:pStyle w:val="TOC1"/>
+            <w:tabs>
+              <w:tab w:val="right" w:leader="dot" w:pos="9016"/>
+            </w:tabs>
+            <w:rPr>
+              <w:rFonts w:asciiTheme="minorHAnsi" w:eastAsiaTheme="minorEastAsia" w:hAnsiTheme="minorHAnsi" w:cstheme="minorBidi"/>
+              <w:noProof/>
+              <w:kern w:val="2"/>
+              <w:sz w:val="24"/>
+              <w:szCs w:val="24"/>
+              <w:lang w:val="en-US" w:eastAsia="en-US"/>
+              <w14:ligatures w14:val="standardContextual"/>
+            </w:rPr>
+          </w:pPr>
+          <w:hyperlink w:anchor="_Toc243411874" w:history="1">
+            <w:r>
+              <w:rPr>
+                <w:rStyle w:val="Hyperlink"/>
+                <w:noProof/>
+              </w:rPr>
+              <w:t>Data Sources</w:t>
+            </w:r>
+            <w:r>
+              <w:rPr>
+                <w:noProof/>
+                <w:webHidden/>
+              </w:rPr>
+              <w:tab/>
+            </w:r>
+            <w:r>
+              <w:rPr>
+                <w:noProof/>
+                <w:webHidden/>
+              </w:rPr>
+              <w:fldChar w:fldCharType="begin"/>
+            </w:r>
+            <w:r>
+              <w:rPr>
+                <w:noProof/>
+                <w:webHidden/>
+              </w:rPr>
+              <w:instrText xml:space="preserve"> PAGEREF _Toc243411874 \h </w:instrText>
+            </w:r>
+            <w:r>
+              <w:rPr>
+                <w:noProof/>
+                <w:webHidden/>
+              </w:rPr>
+            </w:r>
+            <w:r>
+              <w:rPr>
+                <w:noProof/>
+                <w:webHidden/>
+              </w:rPr>
+              <w:fldChar w:fldCharType="separate"/>
+            </w:r>
+            <w:r>
+              <w:rPr>
+                <w:noProof/>
+                <w:webHidden/>
+              </w:rPr>
+              <w:t>6</w:t>
+            </w:r>
+            <w:r>
+              <w:rPr>
+                <w:noProof/>
+                <w:webHidden/>
+              </w:rPr>
+              <w:fldChar w:fldCharType="end"/>
+            </w:r>
+          </w:hyperlink>
+        </w:p>
+        <w:p>
+          <w:pPr>
+            <w:pStyle w:val="TOC1"/>
+            <w:tabs>
+              <w:tab w:val="right" w:leader="dot" w:pos="9016"/>
+            </w:tabs>
+            <w:rPr>
+              <w:rFonts w:asciiTheme="minorHAnsi" w:eastAsiaTheme="minorEastAsia" w:hAnsiTheme="minorHAnsi" w:cstheme="minorBidi"/>
+              <w:noProof/>
+              <w:kern w:val="2"/>
+              <w:sz w:val="24"/>
+              <w:szCs w:val="24"/>
+              <w:lang w:val="en-US" w:eastAsia="en-US"/>
+              <w14:ligatures w14:val="standardContextual"/>
+            </w:rPr>
+          </w:pPr>
+          <w:hyperlink w:anchor="_Toc243411875" w:history="1">
+            <w:r>
+              <w:rPr>
+                <w:rStyle w:val="Hyperlink"/>
+                <w:noProof/>
+              </w:rPr>
+              <w:t>Expected deliverables</w:t>
+            </w:r>
+            <w:r>
+              <w:rPr>
+                <w:noProof/>
+                <w:webHidden/>
+              </w:rPr>
+              <w:tab/>
+            </w:r>
+            <w:r>
+              <w:rPr>
+                <w:noProof/>
+                <w:webHidden/>
+              </w:rPr>
+              <w:fldChar w:fldCharType="begin"/>
+            </w:r>
+            <w:r>
+              <w:rPr>
+                <w:noProof/>
+                <w:webHidden/>
+              </w:rPr>
+              <w:instrText xml:space="preserve"> PAGEREF _Toc243411875 \h </w:instrText>
+            </w:r>
+            <w:r>
+              <w:rPr>
+                <w:noProof/>
+                <w:webHidden/>
+              </w:rPr>
+            </w:r>
+            <w:r>
+              <w:rPr>
+                <w:noProof/>
+                <w:webHidden/>
+              </w:rPr>
+              <w:fldChar w:fldCharType="separate"/>
+            </w:r>
+            <w:r>
+              <w:rPr>
+                <w:noProof/>
+                <w:webHidden/>
+              </w:rPr>
+              <w:t>7</w:t>
+            </w:r>
+            <w:r>
+              <w:rPr>
+                <w:noProof/>
+                <w:webHidden/>
+              </w:rPr>
+              <w:fldChar w:fldCharType="end"/>
+            </w:r>
+          </w:hyperlink>
+        </w:p>
+        <w:p>
+          <w:pPr>
+            <w:pStyle w:val="TOC1"/>
+            <w:tabs>
+              <w:tab w:val="right" w:leader="dot" w:pos="9016"/>
+            </w:tabs>
+            <w:rPr>
+              <w:rFonts w:asciiTheme="minorHAnsi" w:eastAsiaTheme="minorEastAsia" w:hAnsiTheme="minorHAnsi" w:cstheme="minorBidi"/>
+              <w:noProof/>
+              <w:kern w:val="2"/>
+              <w:sz w:val="24"/>
+              <w:szCs w:val="24"/>
+              <w:lang w:val="en-US" w:eastAsia="en-US"/>
+              <w14:ligatures w14:val="standardContextual"/>
+            </w:rPr>
+          </w:pPr>
+          <w:hyperlink w:anchor="_Toc243411876" w:history="1">
+            <w:r>
+              <w:rPr>
+                <w:rStyle w:val="Hyperlink"/>
+                <w:noProof/>
+              </w:rPr>
+              <w:t>Project Timeline</w:t>
+            </w:r>
+            <w:r>
+              <w:rPr>
+                <w:noProof/>
+                <w:webHidden/>
+              </w:rPr>
+              <w:tab/>
+            </w:r>
+            <w:r>
+              <w:rPr>
+                <w:noProof/>
+                <w:webHidden/>
+              </w:rPr>
+              <w:fldChar w:fldCharType="begin"/>
+            </w:r>
+            <w:r>
+              <w:rPr>
+                <w:noProof/>
+                <w:webHidden/>
+              </w:rPr>
+              <w:instrText xml:space="preserve"> PAGEREF _Toc243411876 \h </w:instrText>
+            </w:r>
+            <w:r>
+              <w:rPr>
+                <w:noProof/>
+                <w:webHidden/>
+              </w:rPr>
+            </w:r>
+            <w:r>
+              <w:rPr>
+                <w:noProof/>
+                <w:webHidden/>
+              </w:rPr>
+              <w:fldChar w:fldCharType="separate"/>
+            </w:r>
+            <w:r>
+              <w:rPr>
+                <w:noProof/>
+                <w:webHidden/>
+              </w:rPr>
+              <w:t>8</w:t>
+            </w:r>
+            <w:r>
+              <w:rPr>
+                <w:noProof/>
+                <w:webHidden/>
+              </w:rPr>
+              <w:fldChar w:fldCharType="end"/>
+            </w:r>
+          </w:hyperlink>
+        </w:p>
+        <w:p>
+          <w:pPr>
+            <w:pStyle w:val="TOC1"/>
+            <w:tabs>
+              <w:tab w:val="right" w:leader="dot" w:pos="9016"/>
+            </w:tabs>
+            <w:rPr>
+              <w:rFonts w:asciiTheme="minorHAnsi" w:eastAsiaTheme="minorEastAsia" w:hAnsiTheme="minorHAnsi" w:cstheme="minorBidi"/>
+              <w:noProof/>
+              <w:kern w:val="2"/>
+              <w:sz w:val="24"/>
+              <w:szCs w:val="24"/>
+              <w:lang w:val="en-US" w:eastAsia="en-US"/>
+              <w14:ligatures w14:val="standardContextual"/>
+            </w:rPr>
+          </w:pPr>
+          <w:hyperlink w:anchor="_Toc243411877" w:history="1">
+            <w:r>
+              <w:rPr>
+                <w:rStyle w:val="Hyperlink"/>
+                <w:noProof/>
               </w:rPr>
               <w:t>References</w:t>
             </w:r>
             <w:r>
               <w:rPr>
-                <w:color w:val="000000"/>
+                <w:noProof/>
+                <w:webHidden/>
               </w:rPr>
               <w:tab/>
-              <w:t>2</w:t>
+            </w:r>
+            <w:r>
+              <w:rPr>
+                <w:noProof/>
+                <w:webHidden/>
+              </w:rPr>
+              <w:fldChar w:fldCharType="begin"/>
+            </w:r>
+            <w:r>
+              <w:rPr>
+                <w:noProof/>
+                <w:webHidden/>
+              </w:rPr>
+              <w:instrText xml:space="preserve"> PAGEREF _Toc243411877 \h </w:instrText>
+            </w:r>
+            <w:r>
+              <w:rPr>
+                <w:noProof/>
+                <w:webHidden/>
+              </w:rPr>
+            </w:r>
+            <w:r>
+              <w:rPr>
+                <w:noProof/>
+                <w:webHidden/>
+              </w:rPr>
+              <w:fldChar w:fldCharType="separate"/>
+            </w:r>
+            <w:r>
+              <w:rPr>
+                <w:noProof/>
+                <w:webHidden/>
+              </w:rPr>
+              <w:t>9</w:t>
+            </w:r>
+            <w:r>
+              <w:rPr>
+                <w:noProof/>
+                <w:webHidden/>
+              </w:rPr>
+              <w:fldChar w:fldCharType="end"/>
+            </w:r>
+          </w:hyperlink>
+        </w:p>
+        <w:p>
+          <w:pPr>
+            <w:pStyle w:val="TOC1"/>
+            <w:tabs>
+              <w:tab w:val="right" w:leader="dot" w:pos="9016"/>
+            </w:tabs>
+            <w:rPr>
+              <w:rFonts w:asciiTheme="minorHAnsi" w:eastAsiaTheme="minorEastAsia" w:hAnsiTheme="minorHAnsi" w:cstheme="minorBidi"/>
+              <w:noProof/>
+              <w:kern w:val="2"/>
+              <w:sz w:val="24"/>
+              <w:szCs w:val="24"/>
+              <w:lang w:val="en-US" w:eastAsia="en-US"/>
+              <w14:ligatures w14:val="standardContextual"/>
+            </w:rPr>
+          </w:pPr>
+          <w:hyperlink w:anchor="_Toc243411878" w:history="1">
+            <w:r>
+              <w:rPr>
+                <w:rStyle w:val="Hyperlink"/>
+                <w:noProof/>
+              </w:rPr>
+              <w:t>Appendix</w:t>
+            </w:r>
+            <w:r>
+              <w:rPr>
+                <w:noProof/>
+                <w:webHidden/>
+              </w:rPr>
+              <w:tab/>
+            </w:r>
+            <w:r>
+              <w:rPr>
+                <w:noProof/>
+                <w:webHidden/>
+              </w:rPr>
+              <w:fldChar w:fldCharType="begin"/>
+            </w:r>
+            <w:r>
+              <w:rPr>
+                <w:noProof/>
+                <w:webHidden/>
+              </w:rPr>
+              <w:instrText xml:space="preserve"> PAGEREF _Toc243411878 \h </w:instrText>
+            </w:r>
+            <w:r>
+              <w:rPr>
+                <w:noProof/>
+                <w:webHidden/>
+              </w:rPr>
+            </w:r>
+            <w:r>
+              <w:rPr>
+                <w:noProof/>
+                <w:webHidden/>
+              </w:rPr>
+              <w:fldChar w:fldCharType="separate"/>
+            </w:r>
+            <w:r>
+              <w:rPr>
+                <w:noProof/>
+                <w:webHidden/>
+              </w:rPr>
+              <w:t>10</w:t>
+            </w:r>
+            <w:r>
+              <w:rPr>
+                <w:noProof/>
+                <w:webHidden/>
+              </w:rPr>
+              <w:fldChar w:fldCharType="end"/>
             </w:r>
           </w:hyperlink>
         </w:p>
@@ -1435,21 +2065,6 @@
     <w:p/>
     <w:p>
       <w:pPr>
-        <w:rPr>
-          <w:color w:val="FF0000"/>
-        </w:rPr>
-      </w:pPr>
-      <w:r>
-        <w:rPr>
-          <w:color w:val="FF0000"/>
-        </w:rPr>
-        <w:t>[NOTE: The table of contents above has been included for your convenience. To refresh the table, simply click on it, then select 'Update Table' using the mouse. You can choose to update either the page numbers exclusively or the entire table as needed.]</w:t>
-      </w:r>
-    </w:p>
-    <w:p/>
-    <w:p/>
-    <w:p>
-      <w:pPr>
         <w:sectPr>
           <w:footerReference w:type="default" r:id="rId13"/>
           <w:pgSz w:w="11906" w:h="16838"/>
@@ -1463,14 +2078,13 @@
         <w:pStyle w:val="Heading1"/>
         <w:spacing w:after="0"/>
       </w:pPr>
-      <w:bookmarkStart w:id="10" w:name="_heading=h.gjdgxs" w:colFirst="0" w:colLast="0"/>
-      <w:bookmarkEnd w:id="10"/>
+      <w:bookmarkStart w:id="10" w:name="_Toc243411867"/>
       <w:r>
         <w:lastRenderedPageBreak/>
         <w:t>Introduction</w:t>
       </w:r>
-    </w:p>
-    <w:p/>
+      <w:bookmarkEnd w:id="10"/>
+    </w:p>
     <w:p>
       <w:pPr>
         <w:jc w:val="both"/>
@@ -1569,12 +2183,12 @@
         <w:pStyle w:val="Heading1"/>
         <w:spacing w:before="0"/>
       </w:pPr>
-      <w:bookmarkStart w:id="11" w:name="_heading=h.30j0zll" w:colFirst="0" w:colLast="0"/>
-      <w:bookmarkEnd w:id="11"/>
+      <w:bookmarkStart w:id="11" w:name="_Toc243411868"/>
       <w:r>
         <w:lastRenderedPageBreak/>
         <w:t>Problem Definition</w:t>
       </w:r>
+      <w:bookmarkEnd w:id="11"/>
     </w:p>
     <w:p>
       <w:pPr>
@@ -1627,45 +2241,44 @@
         <w:t xml:space="preserve"> manually: in branches, through WhatsApp</w:t>
       </w:r>
       <w:r>
+        <w:t xml:space="preserve"> where customers send their bank transfer receipts</w:t>
+      </w:r>
+      <w:r>
+        <w:t>,</w:t>
+      </w:r>
+      <w:r>
+        <w:t xml:space="preserve"> and through collectors in Ciudad </w:t>
+      </w:r>
+      <w:proofErr w:type="spellStart"/>
+      <w:r>
+        <w:t>Peronia</w:t>
+      </w:r>
+      <w:proofErr w:type="spellEnd"/>
+      <w:r>
+        <w:t>. Collectors receive a printed list, filtered by hand, of customers who already owe one or more months.</w:t>
+      </w:r>
+    </w:p>
+    <w:p>
+      <w:pPr>
+        <w:jc w:val="both"/>
+      </w:pPr>
+      <w:r>
+        <w:t>As a result, payments pile up on the suspension date: WhatsApp chats are flooded with receipts and branches handle a much higher cash volume that day. Collection is concentrated on specific dates instead of keeping a steady flow throughout the month</w:t>
+      </w:r>
+      <w:r>
+        <w:t>.</w:t>
+      </w:r>
+      <w:r>
         <w:t xml:space="preserve"> </w:t>
       </w:r>
       <w:r>
-        <w:t>where customers send their bank transfer receipts</w:t>
-      </w:r>
-      <w:r>
-        <w:t>,</w:t>
-      </w:r>
-      <w:r>
-        <w:t xml:space="preserve"> and </w:t>
-      </w:r>
-      <w:r>
-        <w:t xml:space="preserve">through collectors in Ciudad </w:t>
-      </w:r>
-      <w:proofErr w:type="spellStart"/>
-      <w:r>
-        <w:t>Peronia</w:t>
-      </w:r>
-      <w:proofErr w:type="spellEnd"/>
-      <w:r>
-        <w:t>. Collectors receive a printed list, filtered by hand, of customers who already owe one or more months.</w:t>
+        <w:t xml:space="preserve">Although the company holds years of payment and reminder history, this data has never been used to decide whom to contact, when or how. </w:t>
       </w:r>
     </w:p>
     <w:p>
       <w:pPr>
         <w:jc w:val="both"/>
       </w:pPr>
-      <w:r>
-        <w:t>As a result, payments pile up on the suspension date: WhatsApp chats are flooded with receipts and branches handle a much higher cash volume that day. Collection is concentrated on specific dates instead of keeping a steady flow throughout the month</w:t>
-      </w:r>
-      <w:r>
-        <w:t>.</w:t>
-      </w:r>
-      <w:r>
-        <w:t xml:space="preserve"> </w:t>
-      </w:r>
-      <w:r>
-        <w:t xml:space="preserve">Although the company holds years of payment and reminder history, this data has never been used to decide whom to contact, when or how. </w:t>
-      </w:r>
     </w:p>
     <w:p>
       <w:pPr>
@@ -1757,31 +2370,27 @@
         <w:jc w:val="both"/>
       </w:pPr>
     </w:p>
-    <w:p>
-      <w:pPr>
-        <w:jc w:val="both"/>
-      </w:pPr>
-    </w:p>
-    <w:p/>
-    <w:p/>
     <w:p>
       <w:pPr>
         <w:pStyle w:val="Heading1"/>
         <w:spacing w:before="0"/>
       </w:pPr>
-      <w:r>
+      <w:bookmarkStart w:id="12" w:name="_Toc243411869"/>
+      <w:r>
+        <w:lastRenderedPageBreak/>
         <w:t>Aim and objectives</w:t>
       </w:r>
+      <w:bookmarkEnd w:id="12"/>
     </w:p>
     <w:p>
       <w:pPr>
         <w:pStyle w:val="Heading2"/>
       </w:pPr>
-      <w:bookmarkStart w:id="12" w:name="_heading=h.1fob9te" w:colFirst="0" w:colLast="0"/>
-      <w:bookmarkEnd w:id="12"/>
+      <w:bookmarkStart w:id="13" w:name="_Toc243411870"/>
       <w:r>
         <w:t>Aim</w:t>
       </w:r>
+      <w:bookmarkEnd w:id="13"/>
     </w:p>
     <w:p>
       <w:pPr>
@@ -1795,9 +2404,11 @@
       <w:pPr>
         <w:pStyle w:val="Heading2"/>
       </w:pPr>
+      <w:bookmarkStart w:id="14" w:name="_Toc243411871"/>
       <w:r>
         <w:t>Objectives</w:t>
       </w:r>
+      <w:bookmarkEnd w:id="14"/>
     </w:p>
     <w:p>
       <w:pPr>
@@ -1820,7 +2431,10 @@
         </w:numPr>
       </w:pPr>
       <w:r>
-        <w:t xml:space="preserve">Train and compare classification models that predict, at the start of each month, whether each customer will pay before the suspension date, using time-based validation, and outperform the company’s practice of contacting customers who owe one or more months. </w:t>
+        <w:t>Train and compare classification models that predict, at the start of each month, whether each customer will pay before the suspension date, using time-based validation, and outperform the company’s practice of contacting customers who owe one or more months</w:t>
+      </w:r>
+      <w:r>
+        <w:t xml:space="preserve"> (target: ROC-AUC &gt;= 0.75).</w:t>
       </w:r>
     </w:p>
     <w:p>
@@ -1844,51 +2458,338 @@
         </w:numPr>
       </w:pPr>
       <w:r>
-        <w:t>Deploy an automated collections decision engine with a monitoring dashboard.</w:t>
-      </w:r>
+        <w:t>Deploy an automated collections decision engine with a monitoring dashboard</w:t>
+      </w:r>
+      <w:r>
+        <w:t xml:space="preserve"> and pilot it for 2-3 months to reduce the late-payment rate and the number of suspensions compared with a control group.</w:t>
+      </w:r>
+    </w:p>
+    <w:p/>
+    <w:p/>
+    <w:p/>
+    <w:p/>
+    <w:p/>
+    <w:p/>
+    <w:p/>
+    <w:p/>
+    <w:p/>
+    <w:p/>
+    <w:p/>
+    <w:p/>
+    <w:p/>
+    <w:p/>
+    <w:p/>
+    <w:p>
+      <w:pPr>
+        <w:pStyle w:val="Heading1"/>
+        <w:spacing w:before="0"/>
+      </w:pPr>
+      <w:bookmarkStart w:id="15" w:name="_Toc243411872"/>
+      <w:r>
+        <w:lastRenderedPageBreak/>
+        <w:t>Scope</w:t>
+      </w:r>
+      <w:bookmarkEnd w:id="15"/>
+    </w:p>
+    <w:p>
+      <w:r>
+        <w:t>In scope</w:t>
+      </w:r>
+    </w:p>
+    <w:p>
+      <w:pPr>
+        <w:pStyle w:val="ListParagraph"/>
+        <w:numPr>
+          <w:ilvl w:val="0"/>
+          <w:numId w:val="8"/>
+        </w:numPr>
+      </w:pPr>
+      <w:r>
+        <w:t xml:space="preserve">Both sectors: Ciudad </w:t>
+      </w:r>
+      <w:proofErr w:type="spellStart"/>
+      <w:r>
+        <w:t>Peronia</w:t>
+      </w:r>
+      <w:proofErr w:type="spellEnd"/>
+      <w:r>
+        <w:t xml:space="preserve"> (collectors, bank transfer, branches) and Sacatepéquez (</w:t>
+      </w:r>
+      <w:proofErr w:type="spellStart"/>
+      <w:r>
+        <w:t>banck</w:t>
+      </w:r>
+      <w:proofErr w:type="spellEnd"/>
+      <w:r>
+        <w:t xml:space="preserve"> transfer, branches; no collectors).</w:t>
+      </w:r>
+    </w:p>
+    <w:p>
+      <w:pPr>
+        <w:pStyle w:val="ListParagraph"/>
+        <w:numPr>
+          <w:ilvl w:val="0"/>
+          <w:numId w:val="8"/>
+        </w:numPr>
+      </w:pPr>
+      <w:r>
+        <w:t xml:space="preserve">All active customers: internet only, cable TV and bundles, with a service type as a model feature. </w:t>
+      </w:r>
+    </w:p>
+    <w:p>
+      <w:pPr>
+        <w:pStyle w:val="ListParagraph"/>
+        <w:numPr>
+          <w:ilvl w:val="0"/>
+          <w:numId w:val="8"/>
+        </w:numPr>
+      </w:pPr>
+      <w:r>
+        <w:t xml:space="preserve">3 years of billing and payment history, suspension records, payment channel, collector assignment. </w:t>
+      </w:r>
+    </w:p>
+    <w:p>
+      <w:pPr>
+        <w:pStyle w:val="ListParagraph"/>
+        <w:numPr>
+          <w:ilvl w:val="0"/>
+          <w:numId w:val="8"/>
+        </w:numPr>
+      </w:pPr>
+      <w:r>
+        <w:t xml:space="preserve">1 year of </w:t>
+      </w:r>
+      <w:proofErr w:type="spellStart"/>
+      <w:r>
+        <w:t>Mercately</w:t>
+      </w:r>
+      <w:proofErr w:type="spellEnd"/>
+      <w:r>
+        <w:t xml:space="preserve"> WhatsApp reminder logs.</w:t>
+      </w:r>
+    </w:p>
+    <w:p>
+      <w:pPr>
+        <w:pStyle w:val="ListParagraph"/>
+        <w:numPr>
+          <w:ilvl w:val="0"/>
+          <w:numId w:val="8"/>
+        </w:numPr>
+      </w:pPr>
+      <w:r>
+        <w:t xml:space="preserve">Late-payment prediction, revenue at risk scoring, automated next-best action rules, prioritised collector sheets (Ciudad </w:t>
+      </w:r>
+      <w:proofErr w:type="spellStart"/>
+      <w:r>
+        <w:t>Peronia</w:t>
+      </w:r>
+      <w:proofErr w:type="spellEnd"/>
+      <w:r>
+        <w:t xml:space="preserve"> only) and a monitoring dashboard.</w:t>
+      </w:r>
+    </w:p>
+    <w:p>
+      <w:pPr>
+        <w:pStyle w:val="Heading1"/>
+        <w:spacing w:before="0"/>
+      </w:pPr>
+    </w:p>
+    <w:p>
+      <w:pPr>
+        <w:pStyle w:val="Heading1"/>
+        <w:spacing w:before="0"/>
+      </w:pPr>
+    </w:p>
+    <w:p>
+      <w:pPr>
+        <w:pStyle w:val="Heading1"/>
+        <w:spacing w:before="0"/>
+      </w:pPr>
+    </w:p>
+    <w:p>
+      <w:pPr>
+        <w:pStyle w:val="Heading1"/>
+        <w:spacing w:before="0"/>
+      </w:pPr>
+    </w:p>
+    <w:p>
+      <w:pPr>
+        <w:pStyle w:val="Heading1"/>
+        <w:spacing w:before="0"/>
+      </w:pPr>
+    </w:p>
+    <w:p>
+      <w:pPr>
+        <w:pStyle w:val="Heading1"/>
+        <w:spacing w:before="0"/>
+      </w:pPr>
+    </w:p>
+    <w:p>
+      <w:pPr>
+        <w:pStyle w:val="Heading1"/>
+        <w:spacing w:before="0"/>
+      </w:pPr>
+    </w:p>
+    <w:p>
+      <w:pPr>
+        <w:pStyle w:val="Heading1"/>
+        <w:spacing w:before="0"/>
+      </w:pPr>
+    </w:p>
+    <w:p>
+      <w:pPr>
+        <w:pStyle w:val="Heading1"/>
+        <w:spacing w:before="0"/>
+      </w:pPr>
+    </w:p>
+    <w:p>
+      <w:pPr>
+        <w:pStyle w:val="Heading1"/>
+        <w:spacing w:before="0"/>
+      </w:pPr>
+    </w:p>
+    <w:p>
+      <w:pPr>
+        <w:pStyle w:val="Heading1"/>
+        <w:spacing w:before="0"/>
+      </w:pPr>
+    </w:p>
+    <w:p>
+      <w:pPr>
+        <w:pStyle w:val="Heading1"/>
+        <w:spacing w:before="0"/>
+      </w:pPr>
+    </w:p>
+    <w:p>
+      <w:pPr>
+        <w:pStyle w:val="Heading1"/>
+        <w:spacing w:before="0"/>
+      </w:pPr>
+    </w:p>
+    <w:p>
+      <w:pPr>
+        <w:pStyle w:val="Heading1"/>
+        <w:spacing w:before="0"/>
+      </w:pPr>
+    </w:p>
+    <w:p>
+      <w:pPr>
+        <w:pStyle w:val="Heading1"/>
+        <w:spacing w:before="0"/>
+      </w:pPr>
+    </w:p>
+    <w:p>
+      <w:pPr>
+        <w:pStyle w:val="Heading1"/>
+        <w:spacing w:before="0"/>
+      </w:pPr>
+    </w:p>
+    <w:p>
+      <w:pPr>
+        <w:pStyle w:val="Heading1"/>
+        <w:spacing w:before="0"/>
+      </w:pPr>
+    </w:p>
+    <w:p>
+      <w:pPr>
+        <w:pStyle w:val="Heading1"/>
+        <w:spacing w:before="0"/>
+      </w:pPr>
+    </w:p>
+    <w:p/>
+    <w:p>
+      <w:pPr>
+        <w:pStyle w:val="Heading1"/>
+        <w:spacing w:before="0"/>
+      </w:pPr>
+      <w:bookmarkStart w:id="16" w:name="_Toc243411873"/>
+      <w:r>
+        <w:lastRenderedPageBreak/>
+        <w:t>Methodology</w:t>
+      </w:r>
+      <w:bookmarkEnd w:id="16"/>
     </w:p>
     <w:p>
       <w:pPr>
         <w:jc w:val="both"/>
       </w:pPr>
+      <w:r>
+        <w:t>Data will be extracted from Cosmovision’s Google Cloud environment, mainly Big Query</w:t>
+      </w:r>
+      <w:r>
+        <w:t xml:space="preserve">, though views containing only the required features. </w:t>
+      </w:r>
+      <w:r>
+        <w:t>C</w:t>
+      </w:r>
+      <w:r>
+        <w:t xml:space="preserve">ustomers’ personal fields will be removed or replaced with random IDs. As the project runs alongside the author’s role at Cosmovision, it will follow an agile approach with regular stakeholder reviews. The analysis will use Python, </w:t>
+      </w:r>
+      <w:proofErr w:type="spellStart"/>
+      <w:r>
+        <w:t>Jupy</w:t>
+      </w:r>
+      <w:r>
+        <w:t>t</w:t>
+      </w:r>
+      <w:r>
+        <w:t>er</w:t>
+      </w:r>
+      <w:proofErr w:type="spellEnd"/>
+      <w:r>
+        <w:t xml:space="preserve"> notebooks</w:t>
+      </w:r>
+      <w:r>
+        <w:t>.</w:t>
+      </w:r>
     </w:p>
     <w:p>
       <w:pPr>
         <w:jc w:val="both"/>
       </w:pPr>
-    </w:p>
-    <w:p>
-      <w:pPr>
-        <w:pStyle w:val="Heading3"/>
-      </w:pPr>
-      <w:bookmarkStart w:id="13" w:name="_heading=h.3znysh7" w:colFirst="0" w:colLast="0"/>
-      <w:bookmarkEnd w:id="13"/>
-      <w:r>
-        <w:t>Chapter 1.1.1.</w:t>
-      </w:r>
-    </w:p>
-    <w:p/>
-    <w:p>
+      <w:r>
+        <w:t xml:space="preserve">Descriptive statistics will establish a baseline of current payment behaviour. Classification models will then be trained on historical data to predict late payment, and the best-performing model will be combined with the amount owed to rank customers. Finally, the model will be automated, shown in a </w:t>
+      </w:r>
+      <w:proofErr w:type="spellStart"/>
+      <w:r>
+        <w:t>Streamlit</w:t>
+      </w:r>
+      <w:proofErr w:type="spellEnd"/>
+      <w:r>
+        <w:t xml:space="preserve"> dashboard and evaluated through a pilot.</w:t>
+      </w:r>
+    </w:p>
+    <w:p>
+      <w:pPr>
+        <w:jc w:val="both"/>
+      </w:pPr>
       <w:r>
         <w:rPr>
           <w:noProof/>
         </w:rPr>
         <w:drawing>
-          <wp:inline distT="0" distB="0" distL="0" distR="0" wp14:anchorId="3D568519" wp14:editId="3B3CDB16">
-            <wp:extent cx="3571875" cy="819150"/>
-            <wp:effectExtent l="0" t="0" r="0" b="0"/>
-            <wp:docPr id="1728545884" name="image2.png" descr="A screenshot of a computer&#10;&#10;Description automatically generated"/>
-            <wp:cNvGraphicFramePr/>
+          <wp:inline distT="0" distB="0" distL="0" distR="0" wp14:anchorId="4DAA576D" wp14:editId="5F8A9FB7">
+            <wp:extent cx="5731510" cy="2687320"/>
+            <wp:effectExtent l="0" t="0" r="0" b="5080"/>
+            <wp:docPr id="478294223" name="Picture 5"/>
+            <wp:cNvGraphicFramePr>
+              <a:graphicFrameLocks xmlns:a="http://schemas.openxmlformats.org/drawingml/2006/main" noChangeAspect="1"/>
+            </wp:cNvGraphicFramePr>
             <a:graphic xmlns:a="http://schemas.openxmlformats.org/drawingml/2006/main">
               <a:graphicData uri="http://schemas.openxmlformats.org/drawingml/2006/picture">
                 <pic:pic xmlns:pic="http://schemas.openxmlformats.org/drawingml/2006/picture">
                   <pic:nvPicPr>
-                    <pic:cNvPr id="0" name="image2.png" descr="A screenshot of a computer&#10;&#10;Description automatically generated"/>
-                    <pic:cNvPicPr preferRelativeResize="0"/>
+                    <pic:cNvPr id="478294223" name="Picture 478294223"/>
+                    <pic:cNvPicPr/>
                   </pic:nvPicPr>
                   <pic:blipFill>
-                    <a:blip r:embed="rId14"/>
-                    <a:srcRect/>
+                    <a:blip r:embed="rId14">
+                      <a:extLst>
+                        <a:ext uri="{28A0092B-C50C-407E-A947-70E740481C1C}">
+                          <a14:useLocalDpi xmlns:a14="http://schemas.microsoft.com/office/drawing/2010/main" val="0"/>
+                        </a:ext>
+                      </a:extLst>
+                    </a:blip>
                     <a:stretch>
                       <a:fillRect/>
                     </a:stretch>
@@ -1896,12 +2797,11 @@
                   <pic:spPr>
                     <a:xfrm>
                       <a:off x="0" y="0"/>
-                      <a:ext cx="3571875" cy="819150"/>
+                      <a:ext cx="5731510" cy="2687320"/>
                     </a:xfrm>
                     <a:prstGeom prst="rect">
                       <a:avLst/>
                     </a:prstGeom>
-                    <a:ln/>
                   </pic:spPr>
                 </pic:pic>
               </a:graphicData>
@@ -1910,6 +2810,571 @@
         </w:drawing>
       </w:r>
     </w:p>
+    <w:p/>
+    <w:p>
+      <w:pPr>
+        <w:jc w:val="both"/>
+      </w:pPr>
+    </w:p>
+    <w:p>
+      <w:pPr>
+        <w:jc w:val="both"/>
+      </w:pPr>
+    </w:p>
+    <w:p/>
+    <w:p/>
+    <w:p/>
+    <w:p/>
+    <w:p/>
+    <w:p/>
+    <w:p/>
+    <w:p/>
+    <w:p/>
+    <w:p>
+      <w:pPr>
+        <w:pStyle w:val="Heading1"/>
+        <w:spacing w:before="0"/>
+      </w:pPr>
+      <w:bookmarkStart w:id="17" w:name="_Toc243411874"/>
+      <w:r>
+        <w:lastRenderedPageBreak/>
+        <w:t>Data Sources</w:t>
+      </w:r>
+      <w:bookmarkEnd w:id="17"/>
+    </w:p>
+    <w:p>
+      <w:r>
+        <w:t>All data comes from Cosmovision’s internal systems, stored in Google Cloud (</w:t>
+      </w:r>
+      <w:proofErr w:type="spellStart"/>
+      <w:r>
+        <w:t>BigQuery</w:t>
+      </w:r>
+      <w:proofErr w:type="spellEnd"/>
+      <w:r>
+        <w:t>), and covers 3 years of history for around 6,000 customers.</w:t>
+      </w:r>
+    </w:p>
+    <w:tbl>
+      <w:tblPr>
+        <w:tblStyle w:val="TableGrid"/>
+        <w:tblW w:w="0" w:type="auto"/>
+        <w:tblLook w:val="04A0" w:firstRow="1" w:lastRow="0" w:firstColumn="1" w:lastColumn="0" w:noHBand="0" w:noVBand="1"/>
+      </w:tblPr>
+      <w:tblGrid>
+        <w:gridCol w:w="2254"/>
+        <w:gridCol w:w="2254"/>
+        <w:gridCol w:w="2254"/>
+        <w:gridCol w:w="2254"/>
+      </w:tblGrid>
+      <w:tr>
+        <w:tc>
+          <w:tcPr>
+            <w:tcW w:w="2254" w:type="dxa"/>
+          </w:tcPr>
+          <w:p>
+            <w:r>
+              <w:t>Source</w:t>
+            </w:r>
+          </w:p>
+        </w:tc>
+        <w:tc>
+          <w:tcPr>
+            <w:tcW w:w="2254" w:type="dxa"/>
+          </w:tcPr>
+          <w:p>
+            <w:r>
+              <w:t>Type</w:t>
+            </w:r>
+          </w:p>
+        </w:tc>
+        <w:tc>
+          <w:tcPr>
+            <w:tcW w:w="2254" w:type="dxa"/>
+          </w:tcPr>
+          <w:p>
+            <w:r>
+              <w:t>Content</w:t>
+            </w:r>
+          </w:p>
+        </w:tc>
+        <w:tc>
+          <w:tcPr>
+            <w:tcW w:w="2254" w:type="dxa"/>
+          </w:tcPr>
+          <w:p>
+            <w:r>
+              <w:t>Relevance</w:t>
+            </w:r>
+          </w:p>
+        </w:tc>
+      </w:tr>
+      <w:tr>
+        <w:tc>
+          <w:tcPr>
+            <w:tcW w:w="2254" w:type="dxa"/>
+          </w:tcPr>
+          <w:p>
+            <w:r>
+              <w:t>Billing and payments</w:t>
+            </w:r>
+          </w:p>
+        </w:tc>
+        <w:tc>
+          <w:tcPr>
+            <w:tcW w:w="2254" w:type="dxa"/>
+          </w:tcPr>
+          <w:p>
+            <w:r>
+              <w:t>Structured (</w:t>
+            </w:r>
+            <w:proofErr w:type="spellStart"/>
+            <w:r>
+              <w:t>BigQuery</w:t>
+            </w:r>
+            <w:proofErr w:type="spellEnd"/>
+            <w:r>
+              <w:t>)</w:t>
+            </w:r>
+          </w:p>
+        </w:tc>
+        <w:tc>
+          <w:tcPr>
+            <w:tcW w:w="2254" w:type="dxa"/>
+          </w:tcPr>
+          <w:p>
+            <w:r>
+              <w:t>Invoices, payment dates, amounts, payment channel</w:t>
+            </w:r>
+          </w:p>
+        </w:tc>
+        <w:tc>
+          <w:tcPr>
+            <w:tcW w:w="2254" w:type="dxa"/>
+          </w:tcPr>
+          <w:p>
+            <w:r>
+              <w:t>Defines on-time and late payment</w:t>
+            </w:r>
+          </w:p>
+        </w:tc>
+      </w:tr>
+      <w:tr>
+        <w:tc>
+          <w:tcPr>
+            <w:tcW w:w="2254" w:type="dxa"/>
+          </w:tcPr>
+          <w:p>
+            <w:r>
+              <w:t>Customers and plans</w:t>
+            </w:r>
+          </w:p>
+        </w:tc>
+        <w:tc>
+          <w:tcPr>
+            <w:tcW w:w="2254" w:type="dxa"/>
+          </w:tcPr>
+          <w:p>
+            <w:r>
+              <w:t>Structured (</w:t>
+            </w:r>
+            <w:proofErr w:type="spellStart"/>
+            <w:r>
+              <w:t>BigQuery</w:t>
+            </w:r>
+            <w:proofErr w:type="spellEnd"/>
+            <w:r>
+              <w:t>)</w:t>
+            </w:r>
+          </w:p>
+        </w:tc>
+        <w:tc>
+          <w:tcPr>
+            <w:tcW w:w="2254" w:type="dxa"/>
+          </w:tcPr>
+          <w:p>
+            <w:r>
+              <w:t>Sector, service, type, plan, price</w:t>
+            </w:r>
+          </w:p>
+        </w:tc>
+        <w:tc>
+          <w:tcPr>
+            <w:tcW w:w="2254" w:type="dxa"/>
+          </w:tcPr>
+          <w:p>
+            <w:r>
+              <w:t>Customer features and the amount owed</w:t>
+            </w:r>
+          </w:p>
+        </w:tc>
+      </w:tr>
+      <w:tr>
+        <w:tc>
+          <w:tcPr>
+            <w:tcW w:w="2254" w:type="dxa"/>
+          </w:tcPr>
+          <w:p>
+            <w:r>
+              <w:t>Collector assignment</w:t>
+            </w:r>
+          </w:p>
+        </w:tc>
+        <w:tc>
+          <w:tcPr>
+            <w:tcW w:w="2254" w:type="dxa"/>
+          </w:tcPr>
+          <w:p>
+            <w:r>
+              <w:t>Structured (</w:t>
+            </w:r>
+            <w:proofErr w:type="spellStart"/>
+            <w:r>
+              <w:t>BigQuery</w:t>
+            </w:r>
+            <w:proofErr w:type="spellEnd"/>
+            <w:r>
+              <w:t>)</w:t>
+            </w:r>
+          </w:p>
+        </w:tc>
+        <w:tc>
+          <w:tcPr>
+            <w:tcW w:w="2254" w:type="dxa"/>
+          </w:tcPr>
+          <w:p>
+            <w:r>
+              <w:t xml:space="preserve">Collector assigned to each customer in Ciudad </w:t>
+            </w:r>
+            <w:proofErr w:type="spellStart"/>
+            <w:r>
+              <w:t>Peronia</w:t>
+            </w:r>
+            <w:proofErr w:type="spellEnd"/>
+          </w:p>
+        </w:tc>
+        <w:tc>
+          <w:tcPr>
+            <w:tcW w:w="2254" w:type="dxa"/>
+          </w:tcPr>
+          <w:p>
+            <w:r>
+              <w:t>Collector sheets and channel analysis</w:t>
+            </w:r>
+          </w:p>
+        </w:tc>
+      </w:tr>
+      <w:tr>
+        <w:tc>
+          <w:tcPr>
+            <w:tcW w:w="2254" w:type="dxa"/>
+          </w:tcPr>
+          <w:p>
+            <w:proofErr w:type="spellStart"/>
+            <w:r>
+              <w:t>Mercately</w:t>
+            </w:r>
+            <w:proofErr w:type="spellEnd"/>
+            <w:r>
+              <w:t xml:space="preserve"> reminders</w:t>
+            </w:r>
+          </w:p>
+        </w:tc>
+        <w:tc>
+          <w:tcPr>
+            <w:tcW w:w="2254" w:type="dxa"/>
+          </w:tcPr>
+          <w:p>
+            <w:r>
+              <w:t>Semi-structured (Excel)</w:t>
+            </w:r>
+          </w:p>
+        </w:tc>
+        <w:tc>
+          <w:tcPr>
+            <w:tcW w:w="2254" w:type="dxa"/>
+          </w:tcPr>
+          <w:p>
+            <w:r>
+              <w:t>WhatsApp reminders sent: customer, date, campaign</w:t>
+            </w:r>
+          </w:p>
+        </w:tc>
+        <w:tc>
+          <w:tcPr>
+            <w:tcW w:w="2254" w:type="dxa"/>
+          </w:tcPr>
+          <w:p>
+            <w:r>
+              <w:t>Reminder history and the pilot</w:t>
+            </w:r>
+          </w:p>
+        </w:tc>
+      </w:tr>
+    </w:tbl>
+    <w:p/>
+    <w:p>
+      <w:r>
+        <w:t>Access to the data is granted by Cosmovision management through a signed permission letter for academic use at CCT. The data will be anonymised before analysis, and it will stay privat</w:t>
+      </w:r>
+      <w:r>
+        <w:t>e.</w:t>
+      </w:r>
+    </w:p>
+    <w:p/>
+    <w:p/>
+    <w:p/>
+    <w:p/>
+    <w:p/>
+    <w:p/>
+    <w:p/>
+    <w:p/>
+    <w:p/>
+    <w:p/>
+    <w:p/>
+    <w:p/>
+    <w:p/>
+    <w:p/>
+    <w:p/>
+    <w:p/>
+    <w:p/>
+    <w:p>
+      <w:pPr>
+        <w:pStyle w:val="Heading1"/>
+        <w:spacing w:before="0"/>
+      </w:pPr>
+      <w:bookmarkStart w:id="18" w:name="_Toc243411875"/>
+      <w:r>
+        <w:lastRenderedPageBreak/>
+        <w:t>Expected deliverables</w:t>
+      </w:r>
+      <w:bookmarkEnd w:id="18"/>
+    </w:p>
+    <w:p>
+      <w:r>
+        <w:t>By the end of Semester 2, the project will deliver:</w:t>
+      </w:r>
+    </w:p>
+    <w:p>
+      <w:pPr>
+        <w:pStyle w:val="ListParagraph"/>
+        <w:numPr>
+          <w:ilvl w:val="0"/>
+          <w:numId w:val="10"/>
+        </w:numPr>
+      </w:pPr>
+      <w:r>
+        <w:rPr>
+          <w:b/>
+          <w:bCs/>
+        </w:rPr>
+        <w:t>A baseline analysis</w:t>
+      </w:r>
+      <w:r>
+        <w:t xml:space="preserve"> of current payment behaviour by sector, service type and payment channel. </w:t>
+      </w:r>
+    </w:p>
+    <w:p>
+      <w:pPr>
+        <w:pStyle w:val="ListParagraph"/>
+        <w:numPr>
+          <w:ilvl w:val="0"/>
+          <w:numId w:val="10"/>
+        </w:numPr>
+      </w:pPr>
+      <w:r>
+        <w:rPr>
+          <w:b/>
+          <w:bCs/>
+        </w:rPr>
+        <w:t>A trained and evaluated prediction model</w:t>
+      </w:r>
+      <w:r>
+        <w:t xml:space="preserve"> that identifies customers at risk of late payment at the start of each month.</w:t>
+      </w:r>
+    </w:p>
+    <w:p>
+      <w:pPr>
+        <w:pStyle w:val="ListParagraph"/>
+        <w:numPr>
+          <w:ilvl w:val="0"/>
+          <w:numId w:val="10"/>
+        </w:numPr>
+      </w:pPr>
+      <w:r>
+        <w:rPr>
+          <w:b/>
+          <w:bCs/>
+        </w:rPr>
+        <w:t>An automated monthly scoring process</w:t>
+      </w:r>
+      <w:r>
+        <w:t xml:space="preserve"> that produces ranked reminder lists and collector sheets for Ciudad </w:t>
+      </w:r>
+      <w:proofErr w:type="spellStart"/>
+      <w:r>
+        <w:t>Peronia</w:t>
+      </w:r>
+      <w:proofErr w:type="spellEnd"/>
+      <w:r>
+        <w:t>.</w:t>
+      </w:r>
+    </w:p>
+    <w:p>
+      <w:pPr>
+        <w:pStyle w:val="ListParagraph"/>
+        <w:numPr>
+          <w:ilvl w:val="0"/>
+          <w:numId w:val="10"/>
+        </w:numPr>
+      </w:pPr>
+      <w:r>
+        <w:rPr>
+          <w:b/>
+          <w:bCs/>
+        </w:rPr>
+        <w:t xml:space="preserve">A </w:t>
+      </w:r>
+      <w:proofErr w:type="spellStart"/>
+      <w:r>
+        <w:rPr>
+          <w:b/>
+          <w:bCs/>
+        </w:rPr>
+        <w:t>Streamlit</w:t>
+      </w:r>
+      <w:proofErr w:type="spellEnd"/>
+      <w:r>
+        <w:rPr>
+          <w:b/>
+          <w:bCs/>
+        </w:rPr>
+        <w:t xml:space="preserve"> dashboard</w:t>
+      </w:r>
+      <w:r>
+        <w:t xml:space="preserve"> showing portfolio-health indicators, risk scores and model performance.</w:t>
+      </w:r>
+    </w:p>
+    <w:p>
+      <w:pPr>
+        <w:pStyle w:val="ListParagraph"/>
+        <w:numPr>
+          <w:ilvl w:val="0"/>
+          <w:numId w:val="10"/>
+        </w:numPr>
+      </w:pPr>
+      <w:r>
+        <w:rPr>
+          <w:b/>
+          <w:bCs/>
+        </w:rPr>
+        <w:t>Pilot results</w:t>
+      </w:r>
+      <w:r>
+        <w:t xml:space="preserve"> comparing the late-payment and suspension rates of the treatment and control groups.</w:t>
+      </w:r>
+    </w:p>
+    <w:p>
+      <w:pPr>
+        <w:pStyle w:val="ListParagraph"/>
+        <w:numPr>
+          <w:ilvl w:val="0"/>
+          <w:numId w:val="10"/>
+        </w:numPr>
+      </w:pPr>
+      <w:r>
+        <w:rPr>
+          <w:b/>
+          <w:bCs/>
+        </w:rPr>
+        <w:t>A GitHub repository</w:t>
+      </w:r>
+      <w:r>
+        <w:t xml:space="preserve"> with documented code and notebooks, and the final report.</w:t>
+      </w:r>
+    </w:p>
+    <w:p/>
+    <w:p/>
+    <w:p/>
+    <w:p/>
+    <w:p/>
+    <w:p/>
+    <w:p/>
+    <w:p/>
+    <w:p/>
+    <w:p/>
+    <w:p/>
+    <w:p/>
+    <w:p/>
+    <w:p/>
+    <w:p/>
+    <w:p/>
+    <w:p/>
+    <w:p/>
+    <w:p/>
+    <w:p/>
+    <w:p/>
+    <w:p>
+      <w:pPr>
+        <w:pStyle w:val="Heading1"/>
+        <w:spacing w:before="0"/>
+      </w:pPr>
+      <w:bookmarkStart w:id="19" w:name="_Toc243411876"/>
+      <w:r>
+        <w:lastRenderedPageBreak/>
+        <w:t>Project Timeline</w:t>
+      </w:r>
+      <w:bookmarkEnd w:id="19"/>
+    </w:p>
+    <w:p>
+      <w:r>
+        <w:rPr>
+          <w:noProof/>
+        </w:rPr>
+        <w:drawing>
+          <wp:inline distT="0" distB="0" distL="0" distR="0" wp14:anchorId="07638893" wp14:editId="7F931D99">
+            <wp:extent cx="5731510" cy="1228725"/>
+            <wp:effectExtent l="0" t="0" r="0" b="3175"/>
+            <wp:docPr id="83212906" name="Picture 6"/>
+            <wp:cNvGraphicFramePr>
+              <a:graphicFrameLocks xmlns:a="http://schemas.openxmlformats.org/drawingml/2006/main" noChangeAspect="1"/>
+            </wp:cNvGraphicFramePr>
+            <a:graphic xmlns:a="http://schemas.openxmlformats.org/drawingml/2006/main">
+              <a:graphicData uri="http://schemas.openxmlformats.org/drawingml/2006/picture">
+                <pic:pic xmlns:pic="http://schemas.openxmlformats.org/drawingml/2006/picture">
+                  <pic:nvPicPr>
+                    <pic:cNvPr id="83212906" name="Picture 83212906"/>
+                    <pic:cNvPicPr/>
+                  </pic:nvPicPr>
+                  <pic:blipFill>
+                    <a:blip r:embed="rId15" cstate="print">
+                      <a:extLst>
+                        <a:ext uri="{28A0092B-C50C-407E-A947-70E740481C1C}">
+                          <a14:useLocalDpi xmlns:a14="http://schemas.microsoft.com/office/drawing/2010/main" val="0"/>
+                        </a:ext>
+                      </a:extLst>
+                    </a:blip>
+                    <a:stretch>
+                      <a:fillRect/>
+                    </a:stretch>
+                  </pic:blipFill>
+                  <pic:spPr>
+                    <a:xfrm>
+                      <a:off x="0" y="0"/>
+                      <a:ext cx="5731510" cy="1228725"/>
+                    </a:xfrm>
+                    <a:prstGeom prst="rect">
+                      <a:avLst/>
+                    </a:prstGeom>
+                  </pic:spPr>
+                </pic:pic>
+              </a:graphicData>
+            </a:graphic>
+          </wp:inline>
+        </w:drawing>
+      </w:r>
+    </w:p>
+    <w:p/>
     <w:p>
       <w:pPr>
         <w:rPr>
@@ -1917,105 +3382,18 @@
         </w:rPr>
       </w:pPr>
     </w:p>
-    <w:p>
-      <w:pPr>
-        <w:rPr>
-          <w:color w:val="FF0000"/>
-        </w:rPr>
-      </w:pPr>
-      <w:r>
-        <w:rPr>
-          <w:color w:val="FF0000"/>
-        </w:rPr>
-        <w:t>[NOTE: For the table of contents to function properly, you must use the correct headings for all your chapters and subchapters.</w:t>
-      </w:r>
-    </w:p>
-    <w:p>
-      <w:pPr>
-        <w:rPr>
-          <w:color w:val="FF0000"/>
-        </w:rPr>
-      </w:pPr>
-      <w:r>
-        <w:rPr>
-          <w:b/>
-          <w:color w:val="FF0000"/>
-        </w:rPr>
-        <w:t>Heading 1:</w:t>
-      </w:r>
-      <w:r>
-        <w:rPr>
-          <w:color w:val="FF0000"/>
-        </w:rPr>
-        <w:t xml:space="preserve"> This is the main heading and should be employed for the primary title or chapter. For example: CHAPTER 1.</w:t>
-      </w:r>
-    </w:p>
-    <w:p>
-      <w:pPr>
-        <w:rPr>
-          <w:color w:val="FF0000"/>
-        </w:rPr>
-      </w:pPr>
-      <w:r>
-        <w:rPr>
-          <w:b/>
-          <w:color w:val="FF0000"/>
-        </w:rPr>
-        <w:t>Heading 2:</w:t>
-      </w:r>
-      <w:r>
-        <w:rPr>
-          <w:color w:val="FF0000"/>
-        </w:rPr>
-        <w:t xml:space="preserve"> Use Heading 2 as a subheading. For instance: Chapter 1.1.</w:t>
-      </w:r>
-    </w:p>
-    <w:p>
-      <w:pPr>
-        <w:rPr>
-          <w:color w:val="FF0000"/>
-        </w:rPr>
-      </w:pPr>
-      <w:r>
-        <w:rPr>
-          <w:b/>
-          <w:color w:val="FF0000"/>
-        </w:rPr>
-        <w:t>Heading 3:</w:t>
-      </w:r>
-      <w:r>
-        <w:rPr>
-          <w:color w:val="FF0000"/>
-        </w:rPr>
-        <w:t xml:space="preserve"> Heading 3 provides a more detailed breakdown, such as Chapter 1.1.1.</w:t>
-      </w:r>
-    </w:p>
-    <w:p>
-      <w:pPr>
-        <w:rPr>
-          <w:color w:val="FF0000"/>
-        </w:rPr>
-      </w:pPr>
-      <w:r>
-        <w:rPr>
-          <w:color w:val="FF0000"/>
-        </w:rPr>
-        <w:t>By adhering to this hierarchical structure, you ensure an organized and effective document outline, enhancing readability and navigation. However, you are not forced to use all 3 headings, usually heading 1 and 2 are sufficient.</w:t>
-      </w:r>
-    </w:p>
-    <w:p>
-      <w:pPr>
-        <w:rPr>
-          <w:color w:val="FF0000"/>
-        </w:rPr>
-      </w:pPr>
-      <w:r>
-        <w:rPr>
-          <w:color w:val="FF0000"/>
-        </w:rPr>
-        <w:t>The remainder of your text should be written using a normal font.]</w:t>
-      </w:r>
-    </w:p>
+    <w:p/>
+    <w:p/>
+    <w:p/>
+    <w:p/>
+    <w:p/>
+    <w:p/>
+    <w:p/>
+    <w:p/>
+    <w:p/>
+    <w:p/>
+    <w:p/>
+    <w:p/>
     <w:p/>
     <w:p/>
     <w:p/>
@@ -2032,11 +3410,11 @@
       <w:pPr>
         <w:pStyle w:val="Heading1"/>
       </w:pPr>
-      <w:bookmarkStart w:id="14" w:name="_heading=h.2et92p0" w:colFirst="0" w:colLast="0"/>
-      <w:bookmarkEnd w:id="14"/>
+      <w:bookmarkStart w:id="20" w:name="_Toc243411877"/>
       <w:r>
         <w:t>References</w:t>
       </w:r>
+      <w:bookmarkEnd w:id="20"/>
     </w:p>
     <w:p/>
     <w:p>
@@ -2093,16 +3471,17 @@
     <w:p/>
     <w:p/>
     <w:p/>
-    <w:p/>
     <w:p>
       <w:pPr>
         <w:pStyle w:val="Heading1"/>
       </w:pPr>
-      <w:bookmarkStart w:id="15" w:name="_heading=h.kfkjs3rwl2c1" w:colFirst="0" w:colLast="0"/>
-      <w:bookmarkEnd w:id="15"/>
+      <w:bookmarkStart w:id="21" w:name="_heading=h.kfkjs3rwl2c1" w:colFirst="0" w:colLast="0"/>
+      <w:bookmarkStart w:id="22" w:name="_Toc243411878"/>
+      <w:bookmarkEnd w:id="21"/>
       <w:r>
         <w:t>Appendix</w:t>
       </w:r>
+      <w:bookmarkEnd w:id="22"/>
     </w:p>
     <w:p/>
     <w:p>
@@ -2160,7 +3539,7 @@
     </w:p>
     <w:p/>
     <w:sectPr>
-      <w:footerReference w:type="default" r:id="rId15"/>
+      <w:footerReference w:type="default" r:id="rId16"/>
       <w:pgSz w:w="11906" w:h="16838"/>
       <w:pgMar w:top="1440" w:right="1440" w:bottom="1440" w:left="1440" w:header="708" w:footer="708" w:gutter="0"/>
       <w:pgNumType w:start="1"/>
@@ -2928,6 +4307,321 @@
     </w:lvl>
   </w:abstractNum>
   <w:abstractNum w:abstractNumId="5" w15:restartNumberingAfterBreak="0">
+    <w:nsid w:val="477A554E"/>
+    <w:multiLevelType w:val="hybridMultilevel"/>
+    <w:tmpl w:val="CB2E5468"/>
+    <w:lvl w:ilvl="0" w:tplc="04090001">
+      <w:start w:val="1"/>
+      <w:numFmt w:val="bullet"/>
+      <w:lvlText w:val=""/>
+      <w:lvlJc w:val="left"/>
+      <w:pPr>
+        <w:ind w:left="720" w:hanging="360"/>
+      </w:pPr>
+      <w:rPr>
+        <w:rFonts w:ascii="Symbol" w:hAnsi="Symbol" w:hint="default"/>
+      </w:rPr>
+    </w:lvl>
+    <w:lvl w:ilvl="1" w:tplc="04090003" w:tentative="1">
+      <w:start w:val="1"/>
+      <w:numFmt w:val="bullet"/>
+      <w:lvlText w:val="o"/>
+      <w:lvlJc w:val="left"/>
+      <w:pPr>
+        <w:ind w:left="1440" w:hanging="360"/>
+      </w:pPr>
+      <w:rPr>
+        <w:rFonts w:ascii="Courier New" w:hAnsi="Courier New" w:cs="Courier New" w:hint="default"/>
+      </w:rPr>
+    </w:lvl>
+    <w:lvl w:ilvl="2" w:tplc="04090005" w:tentative="1">
+      <w:start w:val="1"/>
+      <w:numFmt w:val="bullet"/>
+      <w:lvlText w:val=""/>
+      <w:lvlJc w:val="left"/>
+      <w:pPr>
+        <w:ind w:left="2160" w:hanging="360"/>
+      </w:pPr>
+      <w:rPr>
+        <w:rFonts w:ascii="Wingdings" w:hAnsi="Wingdings" w:hint="default"/>
+      </w:rPr>
+    </w:lvl>
+    <w:lvl w:ilvl="3" w:tplc="04090001" w:tentative="1">
+      <w:start w:val="1"/>
+      <w:numFmt w:val="bullet"/>
+      <w:lvlText w:val=""/>
+      <w:lvlJc w:val="left"/>
+      <w:pPr>
+        <w:ind w:left="2880" w:hanging="360"/>
+      </w:pPr>
+      <w:rPr>
+        <w:rFonts w:ascii="Symbol" w:hAnsi="Symbol" w:hint="default"/>
+      </w:rPr>
+    </w:lvl>
+    <w:lvl w:ilvl="4" w:tplc="04090003" w:tentative="1">
+      <w:start w:val="1"/>
+      <w:numFmt w:val="bullet"/>
+      <w:lvlText w:val="o"/>
+      <w:lvlJc w:val="left"/>
+      <w:pPr>
+        <w:ind w:left="3600" w:hanging="360"/>
+      </w:pPr>
+      <w:rPr>
+        <w:rFonts w:ascii="Courier New" w:hAnsi="Courier New" w:cs="Courier New" w:hint="default"/>
+      </w:rPr>
+    </w:lvl>
+    <w:lvl w:ilvl="5" w:tplc="04090005" w:tentative="1">
+      <w:start w:val="1"/>
+      <w:numFmt w:val="bullet"/>
+      <w:lvlText w:val=""/>
+      <w:lvlJc w:val="left"/>
+      <w:pPr>
+        <w:ind w:left="4320" w:hanging="360"/>
+      </w:pPr>
+      <w:rPr>
+        <w:rFonts w:ascii="Wingdings" w:hAnsi="Wingdings" w:hint="default"/>
+      </w:rPr>
+    </w:lvl>
+    <w:lvl w:ilvl="6" w:tplc="04090001" w:tentative="1">
+      <w:start w:val="1"/>
+      <w:numFmt w:val="bullet"/>
+      <w:lvlText w:val=""/>
+      <w:lvlJc w:val="left"/>
+      <w:pPr>
+        <w:ind w:left="5040" w:hanging="360"/>
+      </w:pPr>
+      <w:rPr>
+        <w:rFonts w:ascii="Symbol" w:hAnsi="Symbol" w:hint="default"/>
+      </w:rPr>
+    </w:lvl>
+    <w:lvl w:ilvl="7" w:tplc="04090003" w:tentative="1">
+      <w:start w:val="1"/>
+      <w:numFmt w:val="bullet"/>
+      <w:lvlText w:val="o"/>
+      <w:lvlJc w:val="left"/>
+      <w:pPr>
+        <w:ind w:left="5760" w:hanging="360"/>
+      </w:pPr>
+      <w:rPr>
+        <w:rFonts w:ascii="Courier New" w:hAnsi="Courier New" w:cs="Courier New" w:hint="default"/>
+      </w:rPr>
+    </w:lvl>
+    <w:lvl w:ilvl="8" w:tplc="04090005" w:tentative="1">
+      <w:start w:val="1"/>
+      <w:numFmt w:val="bullet"/>
+      <w:lvlText w:val=""/>
+      <w:lvlJc w:val="left"/>
+      <w:pPr>
+        <w:ind w:left="6480" w:hanging="360"/>
+      </w:pPr>
+      <w:rPr>
+        <w:rFonts w:ascii="Wingdings" w:hAnsi="Wingdings" w:hint="default"/>
+      </w:rPr>
+    </w:lvl>
+  </w:abstractNum>
+  <w:abstractNum w:abstractNumId="6" w15:restartNumberingAfterBreak="0">
+    <w:nsid w:val="4F007F27"/>
+    <w:multiLevelType w:val="hybridMultilevel"/>
+    <w:tmpl w:val="8C3AF900"/>
+    <w:lvl w:ilvl="0" w:tplc="0409000F">
+      <w:start w:val="1"/>
+      <w:numFmt w:val="decimal"/>
+      <w:lvlText w:val="%1."/>
+      <w:lvlJc w:val="left"/>
+      <w:pPr>
+        <w:ind w:left="720" w:hanging="360"/>
+      </w:pPr>
+      <w:rPr>
+        <w:rFonts w:hint="default"/>
+      </w:rPr>
+    </w:lvl>
+    <w:lvl w:ilvl="1" w:tplc="04090019" w:tentative="1">
+      <w:start w:val="1"/>
+      <w:numFmt w:val="lowerLetter"/>
+      <w:lvlText w:val="%2."/>
+      <w:lvlJc w:val="left"/>
+      <w:pPr>
+        <w:ind w:left="1440" w:hanging="360"/>
+      </w:pPr>
+    </w:lvl>
+    <w:lvl w:ilvl="2" w:tplc="0409001B" w:tentative="1">
+      <w:start w:val="1"/>
+      <w:numFmt w:val="lowerRoman"/>
+      <w:lvlText w:val="%3."/>
+      <w:lvlJc w:val="right"/>
+      <w:pPr>
+        <w:ind w:left="2160" w:hanging="180"/>
+      </w:pPr>
+    </w:lvl>
+    <w:lvl w:ilvl="3" w:tplc="0409000F" w:tentative="1">
+      <w:start w:val="1"/>
+      <w:numFmt w:val="decimal"/>
+      <w:lvlText w:val="%4."/>
+      <w:lvlJc w:val="left"/>
+      <w:pPr>
+        <w:ind w:left="2880" w:hanging="360"/>
+      </w:pPr>
+    </w:lvl>
+    <w:lvl w:ilvl="4" w:tplc="04090019" w:tentative="1">
+      <w:start w:val="1"/>
+      <w:numFmt w:val="lowerLetter"/>
+      <w:lvlText w:val="%5."/>
+      <w:lvlJc w:val="left"/>
+      <w:pPr>
+        <w:ind w:left="3600" w:hanging="360"/>
+      </w:pPr>
+    </w:lvl>
+    <w:lvl w:ilvl="5" w:tplc="0409001B" w:tentative="1">
+      <w:start w:val="1"/>
+      <w:numFmt w:val="lowerRoman"/>
+      <w:lvlText w:val="%6."/>
+      <w:lvlJc w:val="right"/>
+      <w:pPr>
+        <w:ind w:left="4320" w:hanging="180"/>
+      </w:pPr>
+    </w:lvl>
+    <w:lvl w:ilvl="6" w:tplc="0409000F" w:tentative="1">
+      <w:start w:val="1"/>
+      <w:numFmt w:val="decimal"/>
+      <w:lvlText w:val="%7."/>
+      <w:lvlJc w:val="left"/>
+      <w:pPr>
+        <w:ind w:left="5040" w:hanging="360"/>
+      </w:pPr>
+    </w:lvl>
+    <w:lvl w:ilvl="7" w:tplc="04090019" w:tentative="1">
+      <w:start w:val="1"/>
+      <w:numFmt w:val="lowerLetter"/>
+      <w:lvlText w:val="%8."/>
+      <w:lvlJc w:val="left"/>
+      <w:pPr>
+        <w:ind w:left="5760" w:hanging="360"/>
+      </w:pPr>
+    </w:lvl>
+    <w:lvl w:ilvl="8" w:tplc="0409001B" w:tentative="1">
+      <w:start w:val="1"/>
+      <w:numFmt w:val="lowerRoman"/>
+      <w:lvlText w:val="%9."/>
+      <w:lvlJc w:val="right"/>
+      <w:pPr>
+        <w:ind w:left="6480" w:hanging="180"/>
+      </w:pPr>
+    </w:lvl>
+  </w:abstractNum>
+  <w:abstractNum w:abstractNumId="7" w15:restartNumberingAfterBreak="0">
+    <w:nsid w:val="54AE5B67"/>
+    <w:multiLevelType w:val="hybridMultilevel"/>
+    <w:tmpl w:val="BCB4CD1C"/>
+    <w:lvl w:ilvl="0" w:tplc="631C8214">
+      <w:start w:val="5"/>
+      <w:numFmt w:val="bullet"/>
+      <w:lvlText w:val="-"/>
+      <w:lvlJc w:val="left"/>
+      <w:pPr>
+        <w:ind w:left="720" w:hanging="360"/>
+      </w:pPr>
+      <w:rPr>
+        <w:rFonts w:ascii="Calibri" w:eastAsia="Calibri" w:hAnsi="Calibri" w:cs="Calibri" w:hint="default"/>
+      </w:rPr>
+    </w:lvl>
+    <w:lvl w:ilvl="1" w:tplc="04090003" w:tentative="1">
+      <w:start w:val="1"/>
+      <w:numFmt w:val="bullet"/>
+      <w:lvlText w:val="o"/>
+      <w:lvlJc w:val="left"/>
+      <w:pPr>
+        <w:ind w:left="1440" w:hanging="360"/>
+      </w:pPr>
+      <w:rPr>
+        <w:rFonts w:ascii="Courier New" w:hAnsi="Courier New" w:cs="Courier New" w:hint="default"/>
+      </w:rPr>
+    </w:lvl>
+    <w:lvl w:ilvl="2" w:tplc="04090005" w:tentative="1">
+      <w:start w:val="1"/>
+      <w:numFmt w:val="bullet"/>
+      <w:lvlText w:val=""/>
+      <w:lvlJc w:val="left"/>
+      <w:pPr>
+        <w:ind w:left="2160" w:hanging="360"/>
+      </w:pPr>
+      <w:rPr>
+        <w:rFonts w:ascii="Wingdings" w:hAnsi="Wingdings" w:hint="default"/>
+      </w:rPr>
+    </w:lvl>
+    <w:lvl w:ilvl="3" w:tplc="04090001" w:tentative="1">
+      <w:start w:val="1"/>
+      <w:numFmt w:val="bullet"/>
+      <w:lvlText w:val=""/>
+      <w:lvlJc w:val="left"/>
+      <w:pPr>
+        <w:ind w:left="2880" w:hanging="360"/>
+      </w:pPr>
+      <w:rPr>
+        <w:rFonts w:ascii="Symbol" w:hAnsi="Symbol" w:hint="default"/>
+      </w:rPr>
+    </w:lvl>
+    <w:lvl w:ilvl="4" w:tplc="04090003" w:tentative="1">
+      <w:start w:val="1"/>
+      <w:numFmt w:val="bullet"/>
+      <w:lvlText w:val="o"/>
+      <w:lvlJc w:val="left"/>
+      <w:pPr>
+        <w:ind w:left="3600" w:hanging="360"/>
+      </w:pPr>
+      <w:rPr>
+        <w:rFonts w:ascii="Courier New" w:hAnsi="Courier New" w:cs="Courier New" w:hint="default"/>
+      </w:rPr>
+    </w:lvl>
+    <w:lvl w:ilvl="5" w:tplc="04090005" w:tentative="1">
+      <w:start w:val="1"/>
+      <w:numFmt w:val="bullet"/>
+      <w:lvlText w:val=""/>
+      <w:lvlJc w:val="left"/>
+      <w:pPr>
+        <w:ind w:left="4320" w:hanging="360"/>
+      </w:pPr>
+      <w:rPr>
+        <w:rFonts w:ascii="Wingdings" w:hAnsi="Wingdings" w:hint="default"/>
+      </w:rPr>
+    </w:lvl>
+    <w:lvl w:ilvl="6" w:tplc="04090001" w:tentative="1">
+      <w:start w:val="1"/>
+      <w:numFmt w:val="bullet"/>
+      <w:lvlText w:val=""/>
+      <w:lvlJc w:val="left"/>
+      <w:pPr>
+        <w:ind w:left="5040" w:hanging="360"/>
+      </w:pPr>
+      <w:rPr>
+        <w:rFonts w:ascii="Symbol" w:hAnsi="Symbol" w:hint="default"/>
+      </w:rPr>
+    </w:lvl>
+    <w:lvl w:ilvl="7" w:tplc="04090003" w:tentative="1">
+      <w:start w:val="1"/>
+      <w:numFmt w:val="bullet"/>
+      <w:lvlText w:val="o"/>
+      <w:lvlJc w:val="left"/>
+      <w:pPr>
+        <w:ind w:left="5760" w:hanging="360"/>
+      </w:pPr>
+      <w:rPr>
+        <w:rFonts w:ascii="Courier New" w:hAnsi="Courier New" w:cs="Courier New" w:hint="default"/>
+      </w:rPr>
+    </w:lvl>
+    <w:lvl w:ilvl="8" w:tplc="04090005" w:tentative="1">
+      <w:start w:val="1"/>
+      <w:numFmt w:val="bullet"/>
+      <w:lvlText w:val=""/>
+      <w:lvlJc w:val="left"/>
+      <w:pPr>
+        <w:ind w:left="6480" w:hanging="360"/>
+      </w:pPr>
+      <w:rPr>
+        <w:rFonts w:ascii="Wingdings" w:hAnsi="Wingdings" w:hint="default"/>
+      </w:rPr>
+    </w:lvl>
+  </w:abstractNum>
+  <w:abstractNum w:abstractNumId="8" w15:restartNumberingAfterBreak="0">
     <w:nsid w:val="675573C9"/>
     <w:multiLevelType w:val="multilevel"/>
     <w:tmpl w:val="57D27894"/>
@@ -3076,7 +4770,7 @@
       </w:rPr>
     </w:lvl>
   </w:abstractNum>
-  <w:abstractNum w:abstractNumId="6" w15:restartNumberingAfterBreak="0">
+  <w:abstractNum w:abstractNumId="9" w15:restartNumberingAfterBreak="0">
     <w:nsid w:val="7A490A53"/>
     <w:multiLevelType w:val="multilevel"/>
     <w:tmpl w:val="9EA23756"/>
@@ -3232,19 +4926,28 @@
     <w:abstractNumId w:val="1"/>
   </w:num>
   <w:num w:numId="3" w16cid:durableId="728696014">
-    <w:abstractNumId w:val="5"/>
+    <w:abstractNumId w:val="8"/>
   </w:num>
   <w:num w:numId="4" w16cid:durableId="1057824889">
     <w:abstractNumId w:val="0"/>
   </w:num>
   <w:num w:numId="5" w16cid:durableId="716047706">
-    <w:abstractNumId w:val="6"/>
+    <w:abstractNumId w:val="9"/>
   </w:num>
   <w:num w:numId="6" w16cid:durableId="720325003">
     <w:abstractNumId w:val="3"/>
   </w:num>
   <w:num w:numId="7" w16cid:durableId="1930851898">
     <w:abstractNumId w:val="4"/>
+  </w:num>
+  <w:num w:numId="8" w16cid:durableId="1609236481">
+    <w:abstractNumId w:val="5"/>
+  </w:num>
+  <w:num w:numId="9" w16cid:durableId="859322816">
+    <w:abstractNumId w:val="7"/>
+  </w:num>
+  <w:num w:numId="10" w16cid:durableId="1562935202">
+    <w:abstractNumId w:val="6"/>
   </w:num>
 </w:numbering>
 </file>
@@ -4666,10 +6369,29 @@
 </file>
 
 <file path=customXml/item1.xml><?xml version="1.0" encoding="utf-8"?>
-<b:Sources xmlns:b="http://schemas.openxmlformats.org/officeDocument/2006/bibliography" xmlns="http://schemas.openxmlformats.org/officeDocument/2006/bibliography" SelectedStyle="\APASixthEditionOfficeOnline.xsl" StyleName="APA" Version="6"/>
+<?mso-contentType ?>
+<FormTemplates xmlns="http://schemas.microsoft.com/sharepoint/v3/contenttype/forms">
+  <Display>DocumentLibraryForm</Display>
+  <Edit>DocumentLibraryForm</Edit>
+  <New>DocumentLibraryForm</New>
+</FormTemplates>
 </file>
 
 <file path=customXml/item2.xml><?xml version="1.0" encoding="utf-8"?>
+<p:properties xmlns:p="http://schemas.microsoft.com/office/2006/metadata/properties" xmlns:xsi="http://www.w3.org/2001/XMLSchema-instance" xmlns:pc="http://schemas.microsoft.com/office/infopath/2007/PartnerControls">
+  <documentManagement>
+    <_activity xmlns="b16a9495-4dfd-42d3-807b-98cb11f03b43" xsi:nil="true"/>
+  </documentManagement>
+</p:properties>
+</file>
+
+<file path=customXml/item3.xml><?xml version="1.0" encoding="utf-8"?>
+<go:gDocsCustomXmlDataStorage xmlns:go="http://customooxmlschemas.google.com/" xmlns:r="http://schemas.openxmlformats.org/officeDocument/2006/relationships" uri="GoogleDocsCustomDataVersion2">
+  <go:docsCustomData xmlns:go="http://customooxmlschemas.google.com/" roundtripDataSignature="AMtx7miehlgh2pzFvkmpnhkVaeODs3Wnuw==">CgMxLjAyCGguZ2pkZ3hzMgloLjMwajB6bGwyCWguMWZvYjl0ZTIJaC4zem55c2g3MgloLjJldDkycDAyDmgua2ZranMzcndsMmMxOAByITF6bEVRVXYyWkdtTjZWemdfYk5uaGpmb0x1c2hhYUo3dw==</go:docsCustomData>
+</go:gDocsCustomXmlDataStorage>
+</file>
+
+<file path=customXml/item4.xml><?xml version="1.0" encoding="utf-8"?>
 <ct:contentTypeSchema xmlns:ct="http://schemas.microsoft.com/office/2006/metadata/contentType" xmlns:ma="http://schemas.microsoft.com/office/2006/metadata/properties/metaAttributes" ct:_="" ma:_="" ma:contentTypeName="Document" ma:contentTypeID="0x01010091CA7052A48FB44E8BAE44044031FC77" ma:contentTypeVersion="5" ma:contentTypeDescription="Create a new document." ma:contentTypeScope="" ma:versionID="72110da391d7bf7bbbd9879cda66318c">
   <xsd:schema xmlns:xsd="http://www.w3.org/2001/XMLSchema" xmlns:xs="http://www.w3.org/2001/XMLSchema" xmlns:p="http://schemas.microsoft.com/office/2006/metadata/properties" xmlns:ns3="b16a9495-4dfd-42d3-807b-98cb11f03b43" targetNamespace="http://schemas.microsoft.com/office/2006/metadata/properties" ma:root="true" ma:fieldsID="65d4c4ab10123b5e2192ffab3149626d" ns3:_="">
     <xsd:import namespace="b16a9495-4dfd-42d3-807b-98cb11f03b43"/>
@@ -4819,38 +6541,38 @@
 </ct:contentTypeSchema>
 </file>
 
-<file path=customXml/item3.xml><?xml version="1.0" encoding="utf-8"?>
-<go:gDocsCustomXmlDataStorage xmlns:go="http://customooxmlschemas.google.com/" xmlns:r="http://schemas.openxmlformats.org/officeDocument/2006/relationships" uri="GoogleDocsCustomDataVersion2">
-  <go:docsCustomData xmlns:go="http://customooxmlschemas.google.com/" roundtripDataSignature="AMtx7miehlgh2pzFvkmpnhkVaeODs3Wnuw==">CgMxLjAyCGguZ2pkZ3hzMgloLjMwajB6bGwyCWguMWZvYjl0ZTIJaC4zem55c2g3MgloLjJldDkycDAyDmgua2ZranMzcndsMmMxOAByITF6bEVRVXYyWkdtTjZWemdfYk5uaGpmb0x1c2hhYUo3dw==</go:docsCustomData>
-</go:gDocsCustomXmlDataStorage>
-</file>
-
-<file path=customXml/item4.xml><?xml version="1.0" encoding="utf-8"?>
-<p:properties xmlns:p="http://schemas.microsoft.com/office/2006/metadata/properties" xmlns:xsi="http://www.w3.org/2001/XMLSchema-instance" xmlns:pc="http://schemas.microsoft.com/office/infopath/2007/PartnerControls">
-  <documentManagement>
-    <_activity xmlns="b16a9495-4dfd-42d3-807b-98cb11f03b43" xsi:nil="true"/>
-  </documentManagement>
-</p:properties>
-</file>
-
 <file path=customXml/item5.xml><?xml version="1.0" encoding="utf-8"?>
-<?mso-contentType ?>
-<FormTemplates xmlns="http://schemas.microsoft.com/sharepoint/v3/contenttype/forms">
-  <Display>DocumentLibraryForm</Display>
-  <Edit>DocumentLibraryForm</Edit>
-  <New>DocumentLibraryForm</New>
-</FormTemplates>
+<b:Sources xmlns:b="http://schemas.openxmlformats.org/officeDocument/2006/bibliography" xmlns="http://schemas.openxmlformats.org/officeDocument/2006/bibliography" SelectedStyle="\APASixthEditionOfficeOnline.xsl" StyleName="APA" Version="6"/>
 </file>
 
 <file path=customXml/itemProps1.xml><?xml version="1.0" encoding="utf-8"?>
-<ds:datastoreItem xmlns:ds="http://schemas.openxmlformats.org/officeDocument/2006/customXml" ds:itemID="{A5C61161-19E4-4D42-A5DA-EC591AFE0A7D}">
+<ds:datastoreItem xmlns:ds="http://schemas.openxmlformats.org/officeDocument/2006/customXml" ds:itemID="{AD64260C-1345-4C21-A804-B9FBE7B91489}">
   <ds:schemaRefs>
-    <ds:schemaRef ds:uri="http://schemas.openxmlformats.org/officeDocument/2006/bibliography"/>
+    <ds:schemaRef ds:uri="http://schemas.microsoft.com/sharepoint/v3/contenttype/forms"/>
   </ds:schemaRefs>
 </ds:datastoreItem>
 </file>
 
 <file path=customXml/itemProps2.xml><?xml version="1.0" encoding="utf-8"?>
+<ds:datastoreItem xmlns:ds="http://schemas.openxmlformats.org/officeDocument/2006/customXml" ds:itemID="{D51EB97A-8C7A-4EE1-A3AD-E57FDBFA6BEE}">
+  <ds:schemaRefs>
+    <ds:schemaRef ds:uri="http://schemas.microsoft.com/office/2006/metadata/properties"/>
+    <ds:schemaRef ds:uri="http://schemas.microsoft.com/office/infopath/2007/PartnerControls"/>
+    <ds:schemaRef ds:uri="b16a9495-4dfd-42d3-807b-98cb11f03b43"/>
+  </ds:schemaRefs>
+</ds:datastoreItem>
+</file>
+
+<file path=customXml/itemProps3.xml><?xml version="1.0" encoding="utf-8"?>
+<ds:datastoreItem xmlns:ds="http://schemas.openxmlformats.org/officeDocument/2006/customXml" ds:itemID="{11111111-1234-1234-1234-123412341234}">
+  <ds:schemaRefs>
+    <ds:schemaRef ds:uri="http://customooxmlschemas.google.com/"/>
+    <ds:schemaRef ds:uri="http://schemas.openxmlformats.org/officeDocument/2006/relationships"/>
+  </ds:schemaRefs>
+</ds:datastoreItem>
+</file>
+
+<file path=customXml/itemProps4.xml><?xml version="1.0" encoding="utf-8"?>
 <ds:datastoreItem xmlns:ds="http://schemas.openxmlformats.org/officeDocument/2006/customXml" ds:itemID="{1CD39011-2B34-4226-8638-59B13D86301D}">
   <ds:schemaRefs>
     <ds:schemaRef ds:uri="http://schemas.microsoft.com/office/2006/metadata/contentType"/>
@@ -4868,29 +6590,10 @@
 </ds:datastoreItem>
 </file>
 
-<file path=customXml/itemProps3.xml><?xml version="1.0" encoding="utf-8"?>
-<ds:datastoreItem xmlns:ds="http://schemas.openxmlformats.org/officeDocument/2006/customXml" ds:itemID="{11111111-1234-1234-1234-123412341234}">
+<file path=customXml/itemProps5.xml><?xml version="1.0" encoding="utf-8"?>
+<ds:datastoreItem xmlns:ds="http://schemas.openxmlformats.org/officeDocument/2006/customXml" ds:itemID="{A5C61161-19E4-4D42-A5DA-EC591AFE0A7D}">
   <ds:schemaRefs>
-    <ds:schemaRef ds:uri="http://customooxmlschemas.google.com/"/>
-    <ds:schemaRef ds:uri="http://schemas.openxmlformats.org/officeDocument/2006/relationships"/>
-  </ds:schemaRefs>
-</ds:datastoreItem>
-</file>
-
-<file path=customXml/itemProps4.xml><?xml version="1.0" encoding="utf-8"?>
-<ds:datastoreItem xmlns:ds="http://schemas.openxmlformats.org/officeDocument/2006/customXml" ds:itemID="{D51EB97A-8C7A-4EE1-A3AD-E57FDBFA6BEE}">
-  <ds:schemaRefs>
-    <ds:schemaRef ds:uri="http://schemas.microsoft.com/office/2006/metadata/properties"/>
-    <ds:schemaRef ds:uri="http://schemas.microsoft.com/office/infopath/2007/PartnerControls"/>
-    <ds:schemaRef ds:uri="b16a9495-4dfd-42d3-807b-98cb11f03b43"/>
-  </ds:schemaRefs>
-</ds:datastoreItem>
-</file>
-
-<file path=customXml/itemProps5.xml><?xml version="1.0" encoding="utf-8"?>
-<ds:datastoreItem xmlns:ds="http://schemas.openxmlformats.org/officeDocument/2006/customXml" ds:itemID="{AD64260C-1345-4C21-A804-B9FBE7B91489}">
-  <ds:schemaRefs>
-    <ds:schemaRef ds:uri="http://schemas.microsoft.com/sharepoint/v3/contenttype/forms"/>
+    <ds:schemaRef ds:uri="http://schemas.openxmlformats.org/officeDocument/2006/bibliography"/>
   </ds:schemaRefs>
 </ds:datastoreItem>
 </file>
</xml_diff>